<commit_message>
fix(docx): change header color to neutral gray #E0E0E0 and align NIM with 4-column layout
</commit_message>
<xml_diff>
--- a/01_Proposal/OMGTC_2026/Proposal_OMGTC_FEB_UKRIDA_2026.docx
+++ b/01_Proposal/OMGTC_2026/Proposal_OMGTC_FEB_UKRIDA_2026.docx
@@ -1057,6 +1057,7 @@
         <w:tc>
           <w:tcPr>
             <w:tcW w:type="dxa" w:w="1474"/>
+            <w:shd w:fill="E0E0E0"/>
           </w:tcPr>
           <w:p>
             <w:pPr>
@@ -1077,6 +1078,7 @@
         <w:tc>
           <w:tcPr>
             <w:tcW w:type="dxa" w:w="907"/>
+            <w:shd w:fill="E0E0E0"/>
           </w:tcPr>
           <w:p>
             <w:pPr>
@@ -1097,6 +1099,7 @@
         <w:tc>
           <w:tcPr>
             <w:tcW w:type="dxa" w:w="2835"/>
+            <w:shd w:fill="E0E0E0"/>
           </w:tcPr>
           <w:p>
             <w:pPr>
@@ -1117,6 +1120,7 @@
         <w:tc>
           <w:tcPr>
             <w:tcW w:type="dxa" w:w="1361"/>
+            <w:shd w:fill="E0E0E0"/>
           </w:tcPr>
           <w:p>
             <w:pPr>
@@ -1137,6 +1141,7 @@
         <w:tc>
           <w:tcPr>
             <w:tcW w:type="dxa" w:w="1361"/>
+            <w:shd w:fill="E0E0E0"/>
           </w:tcPr>
           <w:p>
             <w:pPr>
@@ -1918,6 +1923,7 @@
         <w:tc>
           <w:tcPr>
             <w:tcW w:type="dxa" w:w="1474"/>
+            <w:shd w:fill="E0E0E0"/>
           </w:tcPr>
           <w:p>
             <w:pPr>
@@ -1938,6 +1944,7 @@
         <w:tc>
           <w:tcPr>
             <w:tcW w:type="dxa" w:w="907"/>
+            <w:shd w:fill="E0E0E0"/>
           </w:tcPr>
           <w:p>
             <w:pPr>
@@ -1958,6 +1965,7 @@
         <w:tc>
           <w:tcPr>
             <w:tcW w:type="dxa" w:w="2835"/>
+            <w:shd w:fill="E0E0E0"/>
           </w:tcPr>
           <w:p>
             <w:pPr>
@@ -1978,6 +1986,7 @@
         <w:tc>
           <w:tcPr>
             <w:tcW w:type="dxa" w:w="1361"/>
+            <w:shd w:fill="E0E0E0"/>
           </w:tcPr>
           <w:p>
             <w:pPr>
@@ -1998,6 +2007,7 @@
         <w:tc>
           <w:tcPr>
             <w:tcW w:type="dxa" w:w="1361"/>
+            <w:shd w:fill="E0E0E0"/>
           </w:tcPr>
           <w:p>
             <w:pPr>
@@ -3677,16 +3687,17 @@
           <w:insideV w:val="none"/>
         </w:tblBorders>
         <w:tblCellMar>
-          <w:top w:w="30" w:type="dxa"/>
-          <w:bottom w:w="30" w:type="dxa"/>
-          <w:left w:w="40" w:type="dxa"/>
-          <w:right w:w="40" w:type="dxa"/>
+          <w:top w:w="25" w:type="dxa"/>
+          <w:bottom w:w="25" w:type="dxa"/>
+          <w:left w:w="30" w:type="dxa"/>
+          <w:right w:w="30" w:type="dxa"/>
         </w:tblCellMar>
       </w:tblPr>
       <w:tblGrid>
-        <w:gridCol w:w="2646"/>
-        <w:gridCol w:w="2646"/>
-        <w:gridCol w:w="2646"/>
+        <w:gridCol w:w="1984"/>
+        <w:gridCol w:w="1984"/>
+        <w:gridCol w:w="1984"/>
+        <w:gridCol w:w="1984"/>
       </w:tblGrid>
       <w:tr>
         <w:trPr>
@@ -3695,7 +3706,7 @@
         </w:trPr>
         <w:tc>
           <w:tcPr>
-            <w:tcW w:type="dxa" w:w="2608"/>
+            <w:tcW w:type="dxa" w:w="2835"/>
           </w:tcPr>
           <w:p>
             <w:pPr>
@@ -3735,7 +3746,8 @@
         </w:tc>
         <w:tc>
           <w:tcPr>
-            <w:tcW w:type="dxa" w:w="5102"/>
+            <w:tcW w:type="dxa" w:w="4876"/>
+            <w:gridSpan w:val="2"/>
           </w:tcPr>
           <w:p>
             <w:pPr>
@@ -3762,7 +3774,7 @@
         </w:trPr>
         <w:tc>
           <w:tcPr>
-            <w:tcW w:type="dxa" w:w="2608"/>
+            <w:tcW w:type="dxa" w:w="2835"/>
           </w:tcPr>
           <w:p>
             <w:pPr>
@@ -3802,7 +3814,8 @@
         </w:tc>
         <w:tc>
           <w:tcPr>
-            <w:tcW w:type="dxa" w:w="5102"/>
+            <w:tcW w:type="dxa" w:w="4876"/>
+            <w:gridSpan w:val="2"/>
           </w:tcPr>
           <w:p>
             <w:pPr>
@@ -3829,7 +3842,7 @@
         </w:trPr>
         <w:tc>
           <w:tcPr>
-            <w:tcW w:type="dxa" w:w="2608"/>
+            <w:tcW w:type="dxa" w:w="2835"/>
           </w:tcPr>
           <w:p>
             <w:pPr>
@@ -3869,7 +3882,7 @@
         </w:tc>
         <w:tc>
           <w:tcPr>
-            <w:tcW w:type="dxa" w:w="5102"/>
+            <w:tcW w:type="dxa" w:w="3175"/>
           </w:tcPr>
           <w:p>
             <w:pPr>
@@ -3884,7 +3897,25 @@
                 <w:sz w:val="24"/>
               </w:rPr>
               <w:t>Arthur Reezan</w:t>
-              <w:tab/>
+            </w:r>
+          </w:p>
+        </w:tc>
+        <w:tc>
+          <w:tcPr>
+            <w:tcW w:type="dxa" w:w="1701"/>
+          </w:tcPr>
+          <w:p>
+            <w:pPr>
+              <w:spacing w:line="276" w:lineRule="auto" w:before="0" w:after="40"/>
+              <w:jc w:val="left"/>
+            </w:pPr>
+            <w:r>
+              <w:rPr>
+                <w:rFonts w:ascii="Times New Roman" w:hAnsi="Times New Roman"/>
+                <w:b w:val="0"/>
+                <w:color w:val="000000"/>
+                <w:sz w:val="24"/>
+              </w:rPr>
               <w:t>(312023002)</w:t>
             </w:r>
           </w:p>
@@ -3896,7 +3927,7 @@
         </w:trPr>
         <w:tc>
           <w:tcPr>
-            <w:tcW w:type="dxa" w:w="2608"/>
+            <w:tcW w:type="dxa" w:w="2835"/>
           </w:tcPr>
           <w:p>
             <w:pPr>
@@ -3936,7 +3967,7 @@
         </w:tc>
         <w:tc>
           <w:tcPr>
-            <w:tcW w:type="dxa" w:w="5102"/>
+            <w:tcW w:type="dxa" w:w="3175"/>
           </w:tcPr>
           <w:p>
             <w:pPr>
@@ -3951,7 +3982,25 @@
                 <w:sz w:val="24"/>
               </w:rPr>
               <w:t>Princess Auralia Barus</w:t>
-              <w:tab/>
+            </w:r>
+          </w:p>
+        </w:tc>
+        <w:tc>
+          <w:tcPr>
+            <w:tcW w:type="dxa" w:w="1701"/>
+          </w:tcPr>
+          <w:p>
+            <w:pPr>
+              <w:spacing w:line="276" w:lineRule="auto" w:before="0" w:after="40"/>
+              <w:jc w:val="left"/>
+            </w:pPr>
+            <w:r>
+              <w:rPr>
+                <w:rFonts w:ascii="Times New Roman" w:hAnsi="Times New Roman"/>
+                <w:b w:val="0"/>
+                <w:color w:val="000000"/>
+                <w:sz w:val="24"/>
+              </w:rPr>
               <w:t>(322024025)</w:t>
             </w:r>
           </w:p>
@@ -3963,7 +4012,7 @@
         </w:trPr>
         <w:tc>
           <w:tcPr>
-            <w:tcW w:type="dxa" w:w="2608"/>
+            <w:tcW w:type="dxa" w:w="2835"/>
           </w:tcPr>
           <w:p>
             <w:pPr>
@@ -4003,7 +4052,7 @@
         </w:tc>
         <w:tc>
           <w:tcPr>
-            <w:tcW w:type="dxa" w:w="5102"/>
+            <w:tcW w:type="dxa" w:w="3175"/>
           </w:tcPr>
           <w:p>
             <w:pPr>
@@ -4018,7 +4067,25 @@
                 <w:sz w:val="24"/>
               </w:rPr>
               <w:t>Fellicia Florens</w:t>
-              <w:tab/>
+            </w:r>
+          </w:p>
+        </w:tc>
+        <w:tc>
+          <w:tcPr>
+            <w:tcW w:type="dxa" w:w="1701"/>
+          </w:tcPr>
+          <w:p>
+            <w:pPr>
+              <w:spacing w:line="276" w:lineRule="auto" w:before="0" w:after="40"/>
+              <w:jc w:val="left"/>
+            </w:pPr>
+            <w:r>
+              <w:rPr>
+                <w:rFonts w:ascii="Times New Roman" w:hAnsi="Times New Roman"/>
+                <w:b w:val="0"/>
+                <w:color w:val="000000"/>
+                <w:sz w:val="24"/>
+              </w:rPr>
               <w:t>(322024018)</w:t>
             </w:r>
           </w:p>
@@ -4030,7 +4097,7 @@
         </w:trPr>
         <w:tc>
           <w:tcPr>
-            <w:tcW w:type="dxa" w:w="2608"/>
+            <w:tcW w:type="dxa" w:w="2835"/>
           </w:tcPr>
           <w:p>
             <w:pPr>
@@ -4070,7 +4137,7 @@
         </w:tc>
         <w:tc>
           <w:tcPr>
-            <w:tcW w:type="dxa" w:w="5102"/>
+            <w:tcW w:type="dxa" w:w="3175"/>
           </w:tcPr>
           <w:p>
             <w:pPr>
@@ -4085,7 +4152,25 @@
                 <w:sz w:val="24"/>
               </w:rPr>
               <w:t>Michelle Angelina</w:t>
-              <w:tab/>
+            </w:r>
+          </w:p>
+        </w:tc>
+        <w:tc>
+          <w:tcPr>
+            <w:tcW w:type="dxa" w:w="1701"/>
+          </w:tcPr>
+          <w:p>
+            <w:pPr>
+              <w:spacing w:line="276" w:lineRule="auto" w:before="0" w:after="40"/>
+              <w:jc w:val="left"/>
+            </w:pPr>
+            <w:r>
+              <w:rPr>
+                <w:rFonts w:ascii="Times New Roman" w:hAnsi="Times New Roman"/>
+                <w:b w:val="0"/>
+                <w:color w:val="000000"/>
+                <w:sz w:val="24"/>
+              </w:rPr>
               <w:t>(312024012)</w:t>
             </w:r>
           </w:p>
@@ -4097,7 +4182,7 @@
         </w:trPr>
         <w:tc>
           <w:tcPr>
-            <w:tcW w:type="dxa" w:w="2608"/>
+            <w:tcW w:type="dxa" w:w="2835"/>
           </w:tcPr>
           <w:p>
             <w:pPr>
@@ -4137,7 +4222,7 @@
         </w:tc>
         <w:tc>
           <w:tcPr>
-            <w:tcW w:type="dxa" w:w="5102"/>
+            <w:tcW w:type="dxa" w:w="3175"/>
           </w:tcPr>
           <w:p>
             <w:pPr>
@@ -4152,7 +4237,25 @@
                 <w:sz w:val="24"/>
               </w:rPr>
               <w:t>Jessica Violant Nathaniel</w:t>
-              <w:tab/>
+            </w:r>
+          </w:p>
+        </w:tc>
+        <w:tc>
+          <w:tcPr>
+            <w:tcW w:type="dxa" w:w="1701"/>
+          </w:tcPr>
+          <w:p>
+            <w:pPr>
+              <w:spacing w:line="276" w:lineRule="auto" w:before="0" w:after="40"/>
+              <w:jc w:val="left"/>
+            </w:pPr>
+            <w:r>
+              <w:rPr>
+                <w:rFonts w:ascii="Times New Roman" w:hAnsi="Times New Roman"/>
+                <w:b w:val="0"/>
+                <w:color w:val="000000"/>
+                <w:sz w:val="24"/>
+              </w:rPr>
               <w:t>(322024015)</w:t>
             </w:r>
           </w:p>
@@ -4164,7 +4267,7 @@
         </w:trPr>
         <w:tc>
           <w:tcPr>
-            <w:tcW w:type="dxa" w:w="2608"/>
+            <w:tcW w:type="dxa" w:w="2835"/>
           </w:tcPr>
           <w:p>
             <w:pPr>
@@ -4204,7 +4307,7 @@
         </w:tc>
         <w:tc>
           <w:tcPr>
-            <w:tcW w:type="dxa" w:w="5102"/>
+            <w:tcW w:type="dxa" w:w="3175"/>
           </w:tcPr>
           <w:p>
             <w:pPr>
@@ -4219,7 +4322,25 @@
                 <w:sz w:val="24"/>
               </w:rPr>
               <w:t>Rachel Angelina Tjahja</w:t>
-              <w:tab/>
+            </w:r>
+          </w:p>
+        </w:tc>
+        <w:tc>
+          <w:tcPr>
+            <w:tcW w:type="dxa" w:w="1701"/>
+          </w:tcPr>
+          <w:p>
+            <w:pPr>
+              <w:spacing w:line="276" w:lineRule="auto" w:before="0" w:after="40"/>
+              <w:jc w:val="left"/>
+            </w:pPr>
+            <w:r>
+              <w:rPr>
+                <w:rFonts w:ascii="Times New Roman" w:hAnsi="Times New Roman"/>
+                <w:b w:val="0"/>
+                <w:color w:val="000000"/>
+                <w:sz w:val="24"/>
+              </w:rPr>
               <w:t>(322024033)</w:t>
             </w:r>
           </w:p>
@@ -4231,7 +4352,7 @@
         </w:trPr>
         <w:tc>
           <w:tcPr>
-            <w:tcW w:type="dxa" w:w="2608"/>
+            <w:tcW w:type="dxa" w:w="2835"/>
           </w:tcPr>
           <w:p>
             <w:pPr>
@@ -4271,7 +4392,7 @@
         </w:tc>
         <w:tc>
           <w:tcPr>
-            <w:tcW w:type="dxa" w:w="5102"/>
+            <w:tcW w:type="dxa" w:w="3175"/>
           </w:tcPr>
           <w:p>
             <w:pPr>
@@ -4286,7 +4407,25 @@
                 <w:sz w:val="24"/>
               </w:rPr>
               <w:t>Jemima Putri Sutanta</w:t>
-              <w:tab/>
+            </w:r>
+          </w:p>
+        </w:tc>
+        <w:tc>
+          <w:tcPr>
+            <w:tcW w:type="dxa" w:w="1701"/>
+          </w:tcPr>
+          <w:p>
+            <w:pPr>
+              <w:spacing w:line="276" w:lineRule="auto" w:before="0" w:after="40"/>
+              <w:jc w:val="left"/>
+            </w:pPr>
+            <w:r>
+              <w:rPr>
+                <w:rFonts w:ascii="Times New Roman" w:hAnsi="Times New Roman"/>
+                <w:b w:val="0"/>
+                <w:color w:val="000000"/>
+                <w:sz w:val="24"/>
+              </w:rPr>
               <w:t>(312024022)</w:t>
             </w:r>
           </w:p>
@@ -4298,7 +4437,7 @@
         </w:trPr>
         <w:tc>
           <w:tcPr>
-            <w:tcW w:type="dxa" w:w="2608"/>
+            <w:tcW w:type="dxa" w:w="2835"/>
           </w:tcPr>
           <w:p>
             <w:pPr>
@@ -4338,7 +4477,7 @@
         </w:tc>
         <w:tc>
           <w:tcPr>
-            <w:tcW w:type="dxa" w:w="5102"/>
+            <w:tcW w:type="dxa" w:w="3175"/>
           </w:tcPr>
           <w:p>
             <w:pPr>
@@ -4353,7 +4492,25 @@
                 <w:sz w:val="24"/>
               </w:rPr>
               <w:t>Vanessa Clarissa</w:t>
-              <w:tab/>
+            </w:r>
+          </w:p>
+        </w:tc>
+        <w:tc>
+          <w:tcPr>
+            <w:tcW w:type="dxa" w:w="1701"/>
+          </w:tcPr>
+          <w:p>
+            <w:pPr>
+              <w:spacing w:line="276" w:lineRule="auto" w:before="0" w:after="120"/>
+              <w:jc w:val="left"/>
+            </w:pPr>
+            <w:r>
+              <w:rPr>
+                <w:rFonts w:ascii="Times New Roman" w:hAnsi="Times New Roman"/>
+                <w:b w:val="0"/>
+                <w:color w:val="000000"/>
+                <w:sz w:val="24"/>
+              </w:rPr>
               <w:t>(322024008)</w:t>
             </w:r>
           </w:p>
@@ -4365,7 +4522,7 @@
         </w:trPr>
         <w:tc>
           <w:tcPr>
-            <w:tcW w:type="dxa" w:w="2608"/>
+            <w:tcW w:type="dxa" w:w="2835"/>
           </w:tcPr>
           <w:p>
             <w:pPr>
@@ -4405,7 +4562,7 @@
         </w:tc>
         <w:tc>
           <w:tcPr>
-            <w:tcW w:type="dxa" w:w="5102"/>
+            <w:tcW w:type="dxa" w:w="3175"/>
           </w:tcPr>
           <w:p>
             <w:pPr>
@@ -4420,7 +4577,25 @@
                 <w:sz w:val="24"/>
               </w:rPr>
               <w:t>Jocelyn Jennifer</w:t>
-              <w:tab/>
+            </w:r>
+          </w:p>
+        </w:tc>
+        <w:tc>
+          <w:tcPr>
+            <w:tcW w:type="dxa" w:w="1701"/>
+          </w:tcPr>
+          <w:p>
+            <w:pPr>
+              <w:spacing w:line="276" w:lineRule="auto" w:before="0" w:after="40"/>
+              <w:jc w:val="left"/>
+            </w:pPr>
+            <w:r>
+              <w:rPr>
+                <w:rFonts w:ascii="Times New Roman" w:hAnsi="Times New Roman"/>
+                <w:b/>
+                <w:color w:val="000000"/>
+                <w:sz w:val="24"/>
+              </w:rPr>
               <w:t>(312024005)</w:t>
             </w:r>
           </w:p>
@@ -4432,11 +4607,11 @@
         </w:trPr>
         <w:tc>
           <w:tcPr>
-            <w:tcW w:type="dxa" w:w="2608"/>
-          </w:tcPr>
-          <w:p>
-            <w:pPr>
-              <w:spacing w:line="276" w:lineRule="auto" w:before="0" w:after="120"/>
+            <w:tcW w:type="dxa" w:w="2835"/>
+          </w:tcPr>
+          <w:p>
+            <w:pPr>
+              <w:spacing w:line="276" w:lineRule="auto" w:before="0" w:after="40"/>
               <w:jc w:val="left"/>
             </w:pPr>
             <w:r>
@@ -4456,7 +4631,7 @@
           </w:tcPr>
           <w:p>
             <w:pPr>
-              <w:spacing w:line="276" w:lineRule="auto" w:before="0" w:after="120"/>
+              <w:spacing w:line="276" w:lineRule="auto" w:before="0" w:after="40"/>
               <w:jc w:val="center"/>
             </w:pPr>
             <w:r>
@@ -4472,11 +4647,11 @@
         </w:tc>
         <w:tc>
           <w:tcPr>
-            <w:tcW w:type="dxa" w:w="5102"/>
-          </w:tcPr>
-          <w:p>
-            <w:pPr>
-              <w:spacing w:line="276" w:lineRule="auto" w:before="0" w:after="120"/>
+            <w:tcW w:type="dxa" w:w="3175"/>
+          </w:tcPr>
+          <w:p>
+            <w:pPr>
+              <w:spacing w:line="276" w:lineRule="auto" w:before="0" w:after="40"/>
               <w:jc w:val="left"/>
             </w:pPr>
             <w:r>
@@ -4487,12 +4662,26 @@
                 <w:sz w:val="24"/>
               </w:rPr>
               <w:t>Christopher Kevin</w:t>
-              <w:tab/>
+            </w:r>
+          </w:p>
+        </w:tc>
+        <w:tc>
+          <w:tcPr>
+            <w:tcW w:type="dxa" w:w="1701"/>
+          </w:tcPr>
+          <w:p>
+            <w:pPr>
+              <w:spacing w:line="276" w:lineRule="auto" w:before="0" w:after="40"/>
+              <w:jc w:val="left"/>
+            </w:pPr>
+            <w:r>
+              <w:rPr>
+                <w:rFonts w:ascii="Times New Roman" w:hAnsi="Times New Roman"/>
+                <w:b w:val="0"/>
+                <w:color w:val="000000"/>
+                <w:sz w:val="24"/>
+              </w:rPr>
               <w:t>(322024030)</w:t>
-              <w:br/>
-              <w:t>Stephanie Nicole</w:t>
-              <w:tab/>
-              <w:t>(312024019)</w:t>
             </w:r>
           </w:p>
         </w:tc>
@@ -4503,21 +4692,20 @@
         </w:trPr>
         <w:tc>
           <w:tcPr>
-            <w:tcW w:type="dxa" w:w="2608"/>
-          </w:tcPr>
-          <w:p>
-            <w:pPr>
-              <w:spacing w:line="276" w:lineRule="auto" w:before="0" w:after="40"/>
+            <w:tcW w:type="dxa" w:w="2835"/>
+          </w:tcPr>
+          <w:p>
+            <w:pPr>
+              <w:spacing w:line="276" w:lineRule="auto" w:before="0" w:after="120"/>
               <w:jc w:val="left"/>
             </w:pPr>
             <w:r>
               <w:rPr>
                 <w:rFonts w:ascii="Times New Roman" w:hAnsi="Times New Roman"/>
-                <w:b/>
+                <w:b w:val="0"/>
                 <w:color w:val="000000"/>
                 <w:sz w:val="24"/>
               </w:rPr>
-              <w:t>Koordinator Perlengkapan</w:t>
             </w:r>
           </w:p>
         </w:tc>
@@ -4527,39 +4715,56 @@
           </w:tcPr>
           <w:p>
             <w:pPr>
-              <w:spacing w:line="276" w:lineRule="auto" w:before="0" w:after="40"/>
+              <w:spacing w:line="276" w:lineRule="auto" w:before="0" w:after="120"/>
               <w:jc w:val="center"/>
             </w:pPr>
             <w:r>
               <w:rPr>
                 <w:rFonts w:ascii="Times New Roman" w:hAnsi="Times New Roman"/>
-                <w:b/>
+                <w:b w:val="0"/>
                 <w:color w:val="000000"/>
                 <w:sz w:val="24"/>
               </w:rPr>
-              <w:t>:</w:t>
-            </w:r>
-          </w:p>
-        </w:tc>
-        <w:tc>
-          <w:tcPr>
-            <w:tcW w:type="dxa" w:w="5102"/>
-          </w:tcPr>
-          <w:p>
-            <w:pPr>
-              <w:spacing w:line="276" w:lineRule="auto" w:before="0" w:after="40"/>
+            </w:r>
+          </w:p>
+        </w:tc>
+        <w:tc>
+          <w:tcPr>
+            <w:tcW w:type="dxa" w:w="3175"/>
+          </w:tcPr>
+          <w:p>
+            <w:pPr>
+              <w:spacing w:line="276" w:lineRule="auto" w:before="0" w:after="120"/>
               <w:jc w:val="left"/>
             </w:pPr>
             <w:r>
               <w:rPr>
                 <w:rFonts w:ascii="Times New Roman" w:hAnsi="Times New Roman"/>
-                <w:b/>
+                <w:b w:val="0"/>
                 <w:color w:val="000000"/>
                 <w:sz w:val="24"/>
               </w:rPr>
-              <w:t>William Hans</w:t>
-              <w:tab/>
-              <w:t>(322024040)</w:t>
+              <w:t>Stephanie Nicole</w:t>
+            </w:r>
+          </w:p>
+        </w:tc>
+        <w:tc>
+          <w:tcPr>
+            <w:tcW w:type="dxa" w:w="1701"/>
+          </w:tcPr>
+          <w:p>
+            <w:pPr>
+              <w:spacing w:line="276" w:lineRule="auto" w:before="0" w:after="120"/>
+              <w:jc w:val="left"/>
+            </w:pPr>
+            <w:r>
+              <w:rPr>
+                <w:rFonts w:ascii="Times New Roman" w:hAnsi="Times New Roman"/>
+                <w:b w:val="0"/>
+                <w:color w:val="000000"/>
+                <w:sz w:val="24"/>
+              </w:rPr>
+              <w:t>(312024019)</w:t>
             </w:r>
           </w:p>
         </w:tc>
@@ -4570,21 +4775,21 @@
         </w:trPr>
         <w:tc>
           <w:tcPr>
-            <w:tcW w:type="dxa" w:w="2608"/>
-          </w:tcPr>
-          <w:p>
-            <w:pPr>
-              <w:spacing w:line="276" w:lineRule="auto" w:before="0" w:after="120"/>
+            <w:tcW w:type="dxa" w:w="2835"/>
+          </w:tcPr>
+          <w:p>
+            <w:pPr>
+              <w:spacing w:line="276" w:lineRule="auto" w:before="0" w:after="40"/>
               <w:jc w:val="left"/>
             </w:pPr>
             <w:r>
               <w:rPr>
                 <w:rFonts w:ascii="Times New Roman" w:hAnsi="Times New Roman"/>
-                <w:b w:val="0"/>
+                <w:b/>
                 <w:color w:val="000000"/>
                 <w:sz w:val="24"/>
               </w:rPr>
-              <w:t>Anggota Perlengkapan</w:t>
+              <w:t>Koordinator Perlengkapan</w:t>
             </w:r>
           </w:p>
         </w:tc>
@@ -4594,13 +4799,13 @@
           </w:tcPr>
           <w:p>
             <w:pPr>
-              <w:spacing w:line="276" w:lineRule="auto" w:before="0" w:after="120"/>
+              <w:spacing w:line="276" w:lineRule="auto" w:before="0" w:after="40"/>
               <w:jc w:val="center"/>
             </w:pPr>
             <w:r>
               <w:rPr>
                 <w:rFonts w:ascii="Times New Roman" w:hAnsi="Times New Roman"/>
-                <w:b w:val="0"/>
+                <w:b/>
                 <w:color w:val="000000"/>
                 <w:sz w:val="24"/>
               </w:rPr>
@@ -4610,27 +4815,41 @@
         </w:tc>
         <w:tc>
           <w:tcPr>
-            <w:tcW w:type="dxa" w:w="5102"/>
-          </w:tcPr>
-          <w:p>
-            <w:pPr>
-              <w:spacing w:line="276" w:lineRule="auto" w:before="0" w:after="120"/>
+            <w:tcW w:type="dxa" w:w="3175"/>
+          </w:tcPr>
+          <w:p>
+            <w:pPr>
+              <w:spacing w:line="276" w:lineRule="auto" w:before="0" w:after="40"/>
               <w:jc w:val="left"/>
             </w:pPr>
             <w:r>
               <w:rPr>
                 <w:rFonts w:ascii="Times New Roman" w:hAnsi="Times New Roman"/>
-                <w:b w:val="0"/>
+                <w:b/>
                 <w:color w:val="000000"/>
                 <w:sz w:val="24"/>
               </w:rPr>
-              <w:t>Michael Jonathan</w:t>
-              <w:tab/>
-              <w:t>(312024028)</w:t>
-              <w:br/>
-              <w:t>David Surya</w:t>
-              <w:tab/>
-              <w:t>(322024011)</w:t>
+              <w:t>William Hans</w:t>
+            </w:r>
+          </w:p>
+        </w:tc>
+        <w:tc>
+          <w:tcPr>
+            <w:tcW w:type="dxa" w:w="1701"/>
+          </w:tcPr>
+          <w:p>
+            <w:pPr>
+              <w:spacing w:line="276" w:lineRule="auto" w:before="0" w:after="40"/>
+              <w:jc w:val="left"/>
+            </w:pPr>
+            <w:r>
+              <w:rPr>
+                <w:rFonts w:ascii="Times New Roman" w:hAnsi="Times New Roman"/>
+                <w:b/>
+                <w:color w:val="000000"/>
+                <w:sz w:val="24"/>
+              </w:rPr>
+              <w:t>(322024040)</w:t>
             </w:r>
           </w:p>
         </w:tc>
@@ -4641,7 +4860,7 @@
         </w:trPr>
         <w:tc>
           <w:tcPr>
-            <w:tcW w:type="dxa" w:w="2608"/>
+            <w:tcW w:type="dxa" w:w="2835"/>
           </w:tcPr>
           <w:p>
             <w:pPr>
@@ -4651,11 +4870,11 @@
             <w:r>
               <w:rPr>
                 <w:rFonts w:ascii="Times New Roman" w:hAnsi="Times New Roman"/>
-                <w:b/>
+                <w:b w:val="0"/>
                 <w:color w:val="000000"/>
                 <w:sz w:val="24"/>
               </w:rPr>
-              <w:t>Koordinator Pubdok</w:t>
+              <w:t>Anggota Perlengkapan</w:t>
             </w:r>
           </w:p>
         </w:tc>
@@ -4671,7 +4890,7 @@
             <w:r>
               <w:rPr>
                 <w:rFonts w:ascii="Times New Roman" w:hAnsi="Times New Roman"/>
-                <w:b/>
+                <w:b w:val="0"/>
                 <w:color w:val="000000"/>
                 <w:sz w:val="24"/>
               </w:rPr>
@@ -4681,7 +4900,7 @@
         </w:tc>
         <w:tc>
           <w:tcPr>
-            <w:tcW w:type="dxa" w:w="5102"/>
+            <w:tcW w:type="dxa" w:w="3175"/>
           </w:tcPr>
           <w:p>
             <w:pPr>
@@ -4691,13 +4910,31 @@
             <w:r>
               <w:rPr>
                 <w:rFonts w:ascii="Times New Roman" w:hAnsi="Times New Roman"/>
-                <w:b/>
+                <w:b w:val="0"/>
                 <w:color w:val="000000"/>
                 <w:sz w:val="24"/>
               </w:rPr>
-              <w:t>Bryan Alexander</w:t>
-              <w:tab/>
-              <w:t>(312024035)</w:t>
+              <w:t>Michael Jonathan</w:t>
+            </w:r>
+          </w:p>
+        </w:tc>
+        <w:tc>
+          <w:tcPr>
+            <w:tcW w:type="dxa" w:w="1701"/>
+          </w:tcPr>
+          <w:p>
+            <w:pPr>
+              <w:spacing w:line="276" w:lineRule="auto" w:before="0" w:after="40"/>
+              <w:jc w:val="left"/>
+            </w:pPr>
+            <w:r>
+              <w:rPr>
+                <w:rFonts w:ascii="Times New Roman" w:hAnsi="Times New Roman"/>
+                <w:b w:val="0"/>
+                <w:color w:val="000000"/>
+                <w:sz w:val="24"/>
+              </w:rPr>
+              <w:t>(312024028)</w:t>
             </w:r>
           </w:p>
         </w:tc>
@@ -4708,7 +4945,7 @@
         </w:trPr>
         <w:tc>
           <w:tcPr>
-            <w:tcW w:type="dxa" w:w="2608"/>
+            <w:tcW w:type="dxa" w:w="2835"/>
           </w:tcPr>
           <w:p>
             <w:pPr>
@@ -4722,7 +4959,6 @@
                 <w:color w:val="000000"/>
                 <w:sz w:val="24"/>
               </w:rPr>
-              <w:t>Anggota Pubdok</w:t>
             </w:r>
           </w:p>
         </w:tc>
@@ -4742,13 +4978,12 @@
                 <w:color w:val="000000"/>
                 <w:sz w:val="24"/>
               </w:rPr>
-              <w:t>:</w:t>
-            </w:r>
-          </w:p>
-        </w:tc>
-        <w:tc>
-          <w:tcPr>
-            <w:tcW w:type="dxa" w:w="5102"/>
+            </w:r>
+          </w:p>
+        </w:tc>
+        <w:tc>
+          <w:tcPr>
+            <w:tcW w:type="dxa" w:w="3175"/>
           </w:tcPr>
           <w:p>
             <w:pPr>
@@ -4762,9 +4997,27 @@
                 <w:color w:val="000000"/>
                 <w:sz w:val="24"/>
               </w:rPr>
-              <w:t>Sharon Priscilla</w:t>
-              <w:tab/>
-              <w:t>(322024029)</w:t>
+              <w:t>David Surya</w:t>
+            </w:r>
+          </w:p>
+        </w:tc>
+        <w:tc>
+          <w:tcPr>
+            <w:tcW w:type="dxa" w:w="1701"/>
+          </w:tcPr>
+          <w:p>
+            <w:pPr>
+              <w:spacing w:line="276" w:lineRule="auto" w:before="0" w:after="120"/>
+              <w:jc w:val="left"/>
+            </w:pPr>
+            <w:r>
+              <w:rPr>
+                <w:rFonts w:ascii="Times New Roman" w:hAnsi="Times New Roman"/>
+                <w:b w:val="0"/>
+                <w:color w:val="000000"/>
+                <w:sz w:val="24"/>
+              </w:rPr>
+              <w:t>(322024011)</w:t>
             </w:r>
           </w:p>
         </w:tc>
@@ -4775,7 +5028,7 @@
         </w:trPr>
         <w:tc>
           <w:tcPr>
-            <w:tcW w:type="dxa" w:w="2608"/>
+            <w:tcW w:type="dxa" w:w="2835"/>
           </w:tcPr>
           <w:p>
             <w:pPr>
@@ -4789,7 +5042,7 @@
                 <w:color w:val="000000"/>
                 <w:sz w:val="24"/>
               </w:rPr>
-              <w:t>Koordinator Humas &amp; Sponsor</w:t>
+              <w:t>Koordinator Pubdok</w:t>
             </w:r>
           </w:p>
         </w:tc>
@@ -4815,7 +5068,7 @@
         </w:tc>
         <w:tc>
           <w:tcPr>
-            <w:tcW w:type="dxa" w:w="5102"/>
+            <w:tcW w:type="dxa" w:w="3175"/>
           </w:tcPr>
           <w:p>
             <w:pPr>
@@ -4829,9 +5082,27 @@
                 <w:color w:val="000000"/>
                 <w:sz w:val="24"/>
               </w:rPr>
-              <w:t>Nathania Graciela</w:t>
-              <w:tab/>
-              <w:t>(312024016)</w:t>
+              <w:t>Bryan Alexander</w:t>
+            </w:r>
+          </w:p>
+        </w:tc>
+        <w:tc>
+          <w:tcPr>
+            <w:tcW w:type="dxa" w:w="1701"/>
+          </w:tcPr>
+          <w:p>
+            <w:pPr>
+              <w:spacing w:line="276" w:lineRule="auto" w:before="0" w:after="40"/>
+              <w:jc w:val="left"/>
+            </w:pPr>
+            <w:r>
+              <w:rPr>
+                <w:rFonts w:ascii="Times New Roman" w:hAnsi="Times New Roman"/>
+                <w:b/>
+                <w:color w:val="000000"/>
+                <w:sz w:val="24"/>
+              </w:rPr>
+              <w:t>(312024035)</w:t>
             </w:r>
           </w:p>
         </w:tc>
@@ -4842,7 +5113,7 @@
         </w:trPr>
         <w:tc>
           <w:tcPr>
-            <w:tcW w:type="dxa" w:w="2608"/>
+            <w:tcW w:type="dxa" w:w="2835"/>
           </w:tcPr>
           <w:p>
             <w:pPr>
@@ -4856,7 +5127,7 @@
                 <w:color w:val="000000"/>
                 <w:sz w:val="24"/>
               </w:rPr>
-              <w:t>Anggota Humas &amp; Sponsor</w:t>
+              <w:t>Anggota Pubdok</w:t>
             </w:r>
           </w:p>
         </w:tc>
@@ -4882,7 +5153,7 @@
         </w:tc>
         <w:tc>
           <w:tcPr>
-            <w:tcW w:type="dxa" w:w="5102"/>
+            <w:tcW w:type="dxa" w:w="3175"/>
           </w:tcPr>
           <w:p>
             <w:pPr>
@@ -4896,9 +5167,27 @@
                 <w:color w:val="000000"/>
                 <w:sz w:val="24"/>
               </w:rPr>
-              <w:t>Steven Immanuel</w:t>
-              <w:tab/>
-              <w:t>(322024021)</w:t>
+              <w:t>Sharon Priscilla</w:t>
+            </w:r>
+          </w:p>
+        </w:tc>
+        <w:tc>
+          <w:tcPr>
+            <w:tcW w:type="dxa" w:w="1701"/>
+          </w:tcPr>
+          <w:p>
+            <w:pPr>
+              <w:spacing w:line="276" w:lineRule="auto" w:before="0" w:after="120"/>
+              <w:jc w:val="left"/>
+            </w:pPr>
+            <w:r>
+              <w:rPr>
+                <w:rFonts w:ascii="Times New Roman" w:hAnsi="Times New Roman"/>
+                <w:b w:val="0"/>
+                <w:color w:val="000000"/>
+                <w:sz w:val="24"/>
+              </w:rPr>
+              <w:t>(322024029)</w:t>
             </w:r>
           </w:p>
         </w:tc>
@@ -4909,7 +5198,7 @@
         </w:trPr>
         <w:tc>
           <w:tcPr>
-            <w:tcW w:type="dxa" w:w="2608"/>
+            <w:tcW w:type="dxa" w:w="2835"/>
           </w:tcPr>
           <w:p>
             <w:pPr>
@@ -4923,7 +5212,7 @@
                 <w:color w:val="000000"/>
                 <w:sz w:val="24"/>
               </w:rPr>
-              <w:t>Koordinator Konsumsi</w:t>
+              <w:t>Koordinator Humas &amp; Sponsor</w:t>
             </w:r>
           </w:p>
         </w:tc>
@@ -4949,7 +5238,7 @@
         </w:tc>
         <w:tc>
           <w:tcPr>
-            <w:tcW w:type="dxa" w:w="5102"/>
+            <w:tcW w:type="dxa" w:w="3175"/>
           </w:tcPr>
           <w:p>
             <w:pPr>
@@ -4963,9 +5252,27 @@
                 <w:color w:val="000000"/>
                 <w:sz w:val="24"/>
               </w:rPr>
-              <w:t>Clarissa Evelyn</w:t>
-              <w:tab/>
-              <w:t>(312024009)</w:t>
+              <w:t>Nathania Graciela</w:t>
+            </w:r>
+          </w:p>
+        </w:tc>
+        <w:tc>
+          <w:tcPr>
+            <w:tcW w:type="dxa" w:w="1701"/>
+          </w:tcPr>
+          <w:p>
+            <w:pPr>
+              <w:spacing w:line="276" w:lineRule="auto" w:before="0" w:after="40"/>
+              <w:jc w:val="left"/>
+            </w:pPr>
+            <w:r>
+              <w:rPr>
+                <w:rFonts w:ascii="Times New Roman" w:hAnsi="Times New Roman"/>
+                <w:b/>
+                <w:color w:val="000000"/>
+                <w:sz w:val="24"/>
+              </w:rPr>
+              <w:t>(312024016)</w:t>
             </w:r>
           </w:p>
         </w:tc>
@@ -4976,7 +5283,177 @@
         </w:trPr>
         <w:tc>
           <w:tcPr>
-            <w:tcW w:type="dxa" w:w="2608"/>
+            <w:tcW w:type="dxa" w:w="2835"/>
+          </w:tcPr>
+          <w:p>
+            <w:pPr>
+              <w:spacing w:line="276" w:lineRule="auto" w:before="0" w:after="120"/>
+              <w:jc w:val="left"/>
+            </w:pPr>
+            <w:r>
+              <w:rPr>
+                <w:rFonts w:ascii="Times New Roman" w:hAnsi="Times New Roman"/>
+                <w:b w:val="0"/>
+                <w:color w:val="000000"/>
+                <w:sz w:val="24"/>
+              </w:rPr>
+              <w:t>Anggota Humas &amp; Sponsor</w:t>
+            </w:r>
+          </w:p>
+        </w:tc>
+        <w:tc>
+          <w:tcPr>
+            <w:tcW w:type="dxa" w:w="227"/>
+          </w:tcPr>
+          <w:p>
+            <w:pPr>
+              <w:spacing w:line="276" w:lineRule="auto" w:before="0" w:after="120"/>
+              <w:jc w:val="center"/>
+            </w:pPr>
+            <w:r>
+              <w:rPr>
+                <w:rFonts w:ascii="Times New Roman" w:hAnsi="Times New Roman"/>
+                <w:b w:val="0"/>
+                <w:color w:val="000000"/>
+                <w:sz w:val="24"/>
+              </w:rPr>
+              <w:t>:</w:t>
+            </w:r>
+          </w:p>
+        </w:tc>
+        <w:tc>
+          <w:tcPr>
+            <w:tcW w:type="dxa" w:w="3175"/>
+          </w:tcPr>
+          <w:p>
+            <w:pPr>
+              <w:spacing w:line="276" w:lineRule="auto" w:before="0" w:after="120"/>
+              <w:jc w:val="left"/>
+            </w:pPr>
+            <w:r>
+              <w:rPr>
+                <w:rFonts w:ascii="Times New Roman" w:hAnsi="Times New Roman"/>
+                <w:b w:val="0"/>
+                <w:color w:val="000000"/>
+                <w:sz w:val="24"/>
+              </w:rPr>
+              <w:t>Steven Immanuel</w:t>
+            </w:r>
+          </w:p>
+        </w:tc>
+        <w:tc>
+          <w:tcPr>
+            <w:tcW w:type="dxa" w:w="1701"/>
+          </w:tcPr>
+          <w:p>
+            <w:pPr>
+              <w:spacing w:line="276" w:lineRule="auto" w:before="0" w:after="120"/>
+              <w:jc w:val="left"/>
+            </w:pPr>
+            <w:r>
+              <w:rPr>
+                <w:rFonts w:ascii="Times New Roman" w:hAnsi="Times New Roman"/>
+                <w:b w:val="0"/>
+                <w:color w:val="000000"/>
+                <w:sz w:val="24"/>
+              </w:rPr>
+              <w:t>(322024021)</w:t>
+            </w:r>
+          </w:p>
+        </w:tc>
+      </w:tr>
+      <w:tr>
+        <w:trPr>
+          <w:cantSplit/>
+        </w:trPr>
+        <w:tc>
+          <w:tcPr>
+            <w:tcW w:type="dxa" w:w="2835"/>
+          </w:tcPr>
+          <w:p>
+            <w:pPr>
+              <w:spacing w:line="276" w:lineRule="auto" w:before="0" w:after="40"/>
+              <w:jc w:val="left"/>
+            </w:pPr>
+            <w:r>
+              <w:rPr>
+                <w:rFonts w:ascii="Times New Roman" w:hAnsi="Times New Roman"/>
+                <w:b/>
+                <w:color w:val="000000"/>
+                <w:sz w:val="24"/>
+              </w:rPr>
+              <w:t>Koordinator Konsumsi</w:t>
+            </w:r>
+          </w:p>
+        </w:tc>
+        <w:tc>
+          <w:tcPr>
+            <w:tcW w:type="dxa" w:w="227"/>
+          </w:tcPr>
+          <w:p>
+            <w:pPr>
+              <w:spacing w:line="276" w:lineRule="auto" w:before="0" w:after="40"/>
+              <w:jc w:val="center"/>
+            </w:pPr>
+            <w:r>
+              <w:rPr>
+                <w:rFonts w:ascii="Times New Roman" w:hAnsi="Times New Roman"/>
+                <w:b/>
+                <w:color w:val="000000"/>
+                <w:sz w:val="24"/>
+              </w:rPr>
+              <w:t>:</w:t>
+            </w:r>
+          </w:p>
+        </w:tc>
+        <w:tc>
+          <w:tcPr>
+            <w:tcW w:type="dxa" w:w="3175"/>
+          </w:tcPr>
+          <w:p>
+            <w:pPr>
+              <w:spacing w:line="276" w:lineRule="auto" w:before="0" w:after="40"/>
+              <w:jc w:val="left"/>
+            </w:pPr>
+            <w:r>
+              <w:rPr>
+                <w:rFonts w:ascii="Times New Roman" w:hAnsi="Times New Roman"/>
+                <w:b/>
+                <w:color w:val="000000"/>
+                <w:sz w:val="24"/>
+              </w:rPr>
+              <w:t>Clarissa Evelyn</w:t>
+            </w:r>
+          </w:p>
+        </w:tc>
+        <w:tc>
+          <w:tcPr>
+            <w:tcW w:type="dxa" w:w="1701"/>
+          </w:tcPr>
+          <w:p>
+            <w:pPr>
+              <w:spacing w:line="276" w:lineRule="auto" w:before="0" w:after="40"/>
+              <w:jc w:val="left"/>
+            </w:pPr>
+            <w:r>
+              <w:rPr>
+                <w:rFonts w:ascii="Times New Roman" w:hAnsi="Times New Roman"/>
+                <w:b/>
+                <w:color w:val="000000"/>
+                <w:sz w:val="24"/>
+              </w:rPr>
+              <w:t>(312024009)</w:t>
+            </w:r>
+          </w:p>
+        </w:tc>
+      </w:tr>
+      <w:tr>
+        <w:trPr>
+          <w:cantSplit/>
+        </w:trPr>
+        <w:tc>
+          <w:tcPr>
+            <w:tcW w:type="dxa" w:w="2835"/>
           </w:tcPr>
           <w:p>
             <w:pPr>
@@ -5016,7 +5493,7 @@
         </w:tc>
         <w:tc>
           <w:tcPr>
-            <w:tcW w:type="dxa" w:w="5102"/>
+            <w:tcW w:type="dxa" w:w="3175"/>
           </w:tcPr>
           <w:p>
             <w:pPr>
@@ -5031,7 +5508,25 @@
                 <w:sz w:val="24"/>
               </w:rPr>
               <w:t>Jennifer Amanda</w:t>
-              <w:tab/>
+            </w:r>
+          </w:p>
+        </w:tc>
+        <w:tc>
+          <w:tcPr>
+            <w:tcW w:type="dxa" w:w="1701"/>
+          </w:tcPr>
+          <w:p>
+            <w:pPr>
+              <w:spacing w:line="276" w:lineRule="auto" w:before="0" w:after="80"/>
+              <w:jc w:val="left"/>
+            </w:pPr>
+            <w:r>
+              <w:rPr>
+                <w:rFonts w:ascii="Times New Roman" w:hAnsi="Times New Roman"/>
+                <w:b w:val="0"/>
+                <w:color w:val="000000"/>
+                <w:sz w:val="24"/>
+              </w:rPr>
               <w:t>(322024027)</w:t>
             </w:r>
           </w:p>
@@ -5106,7 +5601,7 @@
         <w:tc>
           <w:tcPr>
             <w:tcW w:type="dxa" w:w="680"/>
-            <w:shd w:fill="B3E4A1"/>
+            <w:shd w:fill="E0E0E0"/>
           </w:tcPr>
           <w:p>
             <w:pPr>
@@ -5127,7 +5622,7 @@
         <w:tc>
           <w:tcPr>
             <w:tcW w:type="dxa" w:w="5272"/>
-            <w:shd w:fill="B3E4A1"/>
+            <w:shd w:fill="E0E0E0"/>
           </w:tcPr>
           <w:p>
             <w:pPr>
@@ -5148,7 +5643,7 @@
         <w:tc>
           <w:tcPr>
             <w:tcW w:type="dxa" w:w="1984"/>
-            <w:shd w:fill="B3E4A1"/>
+            <w:shd w:fill="E0E0E0"/>
           </w:tcPr>
           <w:p>
             <w:pPr>
@@ -5361,7 +5856,7 @@
         <w:tc>
           <w:tcPr>
             <w:tcW w:type="dxa" w:w="567"/>
-            <w:shd w:fill="B3E4A1"/>
+            <w:shd w:fill="E0E0E0"/>
           </w:tcPr>
           <w:p>
             <w:pPr>
@@ -5382,7 +5877,7 @@
         <w:tc>
           <w:tcPr>
             <w:tcW w:type="dxa" w:w="3288"/>
-            <w:shd w:fill="B3E4A1"/>
+            <w:shd w:fill="E0E0E0"/>
           </w:tcPr>
           <w:p>
             <w:pPr>
@@ -5403,7 +5898,7 @@
         <w:tc>
           <w:tcPr>
             <w:tcW w:type="dxa" w:w="1247"/>
-            <w:shd w:fill="B3E4A1"/>
+            <w:shd w:fill="E0E0E0"/>
           </w:tcPr>
           <w:p>
             <w:pPr>
@@ -5424,7 +5919,7 @@
         <w:tc>
           <w:tcPr>
             <w:tcW w:type="dxa" w:w="1417"/>
-            <w:shd w:fill="B3E4A1"/>
+            <w:shd w:fill="E0E0E0"/>
           </w:tcPr>
           <w:p>
             <w:pPr>
@@ -5445,7 +5940,7 @@
         <w:tc>
           <w:tcPr>
             <w:tcW w:type="dxa" w:w="1417"/>
-            <w:shd w:fill="B3E4A1"/>
+            <w:shd w:fill="E0E0E0"/>
           </w:tcPr>
           <w:p>
             <w:pPr>
@@ -5917,7 +6412,7 @@
         <w:tc>
           <w:tcPr>
             <w:tcW w:type="dxa" w:w="567"/>
-            <w:shd w:fill="B3E4A1"/>
+            <w:shd w:fill="E0E0E0"/>
           </w:tcPr>
           <w:p>
             <w:pPr>
@@ -5938,7 +6433,7 @@
         <w:tc>
           <w:tcPr>
             <w:tcW w:type="dxa" w:w="3288"/>
-            <w:shd w:fill="B3E4A1"/>
+            <w:shd w:fill="E0E0E0"/>
           </w:tcPr>
           <w:p>
             <w:pPr>
@@ -5959,7 +6454,7 @@
         <w:tc>
           <w:tcPr>
             <w:tcW w:type="dxa" w:w="1247"/>
-            <w:shd w:fill="B3E4A1"/>
+            <w:shd w:fill="E0E0E0"/>
           </w:tcPr>
           <w:p>
             <w:pPr>
@@ -5980,7 +6475,7 @@
         <w:tc>
           <w:tcPr>
             <w:tcW w:type="dxa" w:w="1417"/>
-            <w:shd w:fill="B3E4A1"/>
+            <w:shd w:fill="E0E0E0"/>
           </w:tcPr>
           <w:p>
             <w:pPr>
@@ -6001,7 +6496,7 @@
         <w:tc>
           <w:tcPr>
             <w:tcW w:type="dxa" w:w="1417"/>
-            <w:shd w:fill="B3E4A1"/>
+            <w:shd w:fill="E0E0E0"/>
           </w:tcPr>
           <w:p>
             <w:pPr>
@@ -6373,7 +6868,7 @@
         <w:tc>
           <w:tcPr>
             <w:tcW w:type="dxa" w:w="567"/>
-            <w:shd w:fill="B3E4A1"/>
+            <w:shd w:fill="E0E0E0"/>
           </w:tcPr>
           <w:p>
             <w:pPr>
@@ -6394,7 +6889,7 @@
         <w:tc>
           <w:tcPr>
             <w:tcW w:type="dxa" w:w="3288"/>
-            <w:shd w:fill="B3E4A1"/>
+            <w:shd w:fill="E0E0E0"/>
           </w:tcPr>
           <w:p>
             <w:pPr>
@@ -6415,7 +6910,7 @@
         <w:tc>
           <w:tcPr>
             <w:tcW w:type="dxa" w:w="1247"/>
-            <w:shd w:fill="B3E4A1"/>
+            <w:shd w:fill="E0E0E0"/>
           </w:tcPr>
           <w:p>
             <w:pPr>
@@ -6436,7 +6931,7 @@
         <w:tc>
           <w:tcPr>
             <w:tcW w:type="dxa" w:w="1417"/>
-            <w:shd w:fill="B3E4A1"/>
+            <w:shd w:fill="E0E0E0"/>
           </w:tcPr>
           <w:p>
             <w:pPr>
@@ -6457,7 +6952,7 @@
         <w:tc>
           <w:tcPr>
             <w:tcW w:type="dxa" w:w="1417"/>
-            <w:shd w:fill="B3E4A1"/>
+            <w:shd w:fill="E0E0E0"/>
           </w:tcPr>
           <w:p>
             <w:pPr>
@@ -6929,7 +7424,7 @@
         <w:tc>
           <w:tcPr>
             <w:tcW w:type="dxa" w:w="567"/>
-            <w:shd w:fill="B3E4A1"/>
+            <w:shd w:fill="E0E0E0"/>
           </w:tcPr>
           <w:p>
             <w:pPr>
@@ -6950,7 +7445,7 @@
         <w:tc>
           <w:tcPr>
             <w:tcW w:type="dxa" w:w="3288"/>
-            <w:shd w:fill="B3E4A1"/>
+            <w:shd w:fill="E0E0E0"/>
           </w:tcPr>
           <w:p>
             <w:pPr>
@@ -6971,7 +7466,7 @@
         <w:tc>
           <w:tcPr>
             <w:tcW w:type="dxa" w:w="1247"/>
-            <w:shd w:fill="B3E4A1"/>
+            <w:shd w:fill="E0E0E0"/>
           </w:tcPr>
           <w:p>
             <w:pPr>
@@ -6992,7 +7487,7 @@
         <w:tc>
           <w:tcPr>
             <w:tcW w:type="dxa" w:w="1417"/>
-            <w:shd w:fill="B3E4A1"/>
+            <w:shd w:fill="E0E0E0"/>
           </w:tcPr>
           <w:p>
             <w:pPr>
@@ -7013,7 +7508,7 @@
         <w:tc>
           <w:tcPr>
             <w:tcW w:type="dxa" w:w="1417"/>
-            <w:shd w:fill="B3E4A1"/>
+            <w:shd w:fill="E0E0E0"/>
           </w:tcPr>
           <w:p>
             <w:pPr>
@@ -7585,7 +8080,7 @@
         <w:tc>
           <w:tcPr>
             <w:tcW w:type="dxa" w:w="567"/>
-            <w:shd w:fill="B3E4A1"/>
+            <w:shd w:fill="E0E0E0"/>
           </w:tcPr>
           <w:p>
             <w:pPr>
@@ -7606,7 +8101,7 @@
         <w:tc>
           <w:tcPr>
             <w:tcW w:type="dxa" w:w="3288"/>
-            <w:shd w:fill="B3E4A1"/>
+            <w:shd w:fill="E0E0E0"/>
           </w:tcPr>
           <w:p>
             <w:pPr>
@@ -7627,7 +8122,7 @@
         <w:tc>
           <w:tcPr>
             <w:tcW w:type="dxa" w:w="1247"/>
-            <w:shd w:fill="B3E4A1"/>
+            <w:shd w:fill="E0E0E0"/>
           </w:tcPr>
           <w:p>
             <w:pPr>
@@ -7648,7 +8143,7 @@
         <w:tc>
           <w:tcPr>
             <w:tcW w:type="dxa" w:w="1417"/>
-            <w:shd w:fill="B3E4A1"/>
+            <w:shd w:fill="E0E0E0"/>
           </w:tcPr>
           <w:p>
             <w:pPr>
@@ -7669,7 +8164,7 @@
         <w:tc>
           <w:tcPr>
             <w:tcW w:type="dxa" w:w="1417"/>
-            <w:shd w:fill="B3E4A1"/>
+            <w:shd w:fill="E0E0E0"/>
           </w:tcPr>
           <w:p>
             <w:pPr>
@@ -8042,7 +8537,7 @@
         <w:tc>
           <w:tcPr>
             <w:tcW w:type="dxa" w:w="680"/>
-            <w:shd w:fill="B3E4A1"/>
+            <w:shd w:fill="E0E0E0"/>
           </w:tcPr>
           <w:p>
             <w:pPr>
@@ -8063,7 +8558,7 @@
         <w:tc>
           <w:tcPr>
             <w:tcW w:type="dxa" w:w="5272"/>
-            <w:shd w:fill="B3E4A1"/>
+            <w:shd w:fill="E0E0E0"/>
           </w:tcPr>
           <w:p>
             <w:pPr>
@@ -8084,7 +8579,7 @@
         <w:tc>
           <w:tcPr>
             <w:tcW w:type="dxa" w:w="1984"/>
-            <w:shd w:fill="B3E4A1"/>
+            <w:shd w:fill="E0E0E0"/>
           </w:tcPr>
           <w:p>
             <w:pPr>
@@ -8606,7 +9101,7 @@
         <w:tc>
           <w:tcPr>
             <w:tcW w:type="dxa" w:w="5953"/>
-            <w:shd w:fill="B3E4A1"/>
+            <w:shd w:fill="E0E0E0"/>
           </w:tcPr>
           <w:p>
             <w:pPr>
@@ -8627,7 +9122,7 @@
         <w:tc>
           <w:tcPr>
             <w:tcW w:type="dxa" w:w="1984"/>
-            <w:shd w:fill="B3E4A1"/>
+            <w:shd w:fill="E0E0E0"/>
           </w:tcPr>
           <w:p>
             <w:pPr>

</xml_diff>

<commit_message>
fix(proposal): remove division expenses (zero expense BEM FEB) and remove black box background from BEM FEB logo
</commit_message>
<xml_diff>
--- a/01_Proposal/OMGTC_2026/Proposal_OMGTC_FEB_UKRIDA_2026.docx
+++ b/01_Proposal/OMGTC_2026/Proposal_OMGTC_FEB_UKRIDA_2026.docx
@@ -40,13 +40,13 @@
     </w:p>
     <w:p>
       <w:pPr>
-        <w:spacing w:before="560" w:after="560"/>
+        <w:spacing w:before="400" w:after="400"/>
         <w:jc w:val="center"/>
       </w:pPr>
       <w:r>
         <w:drawing>
           <wp:inline xmlns:a="http://schemas.openxmlformats.org/drawingml/2006/main" xmlns:pic="http://schemas.openxmlformats.org/drawingml/2006/picture">
-            <wp:extent cx="4140000" cy="4140000"/>
+            <wp:extent cx="3060000" cy="3570000"/>
             <wp:docPr id="1" name="Picture 1"/>
             <wp:cNvGraphicFramePr>
               <a:graphicFrameLocks noChangeAspect="1"/>
@@ -67,7 +67,7 @@
                   <pic:spPr>
                     <a:xfrm>
                       <a:off x="0" y="0"/>
-                      <a:ext cx="4140000" cy="4140000"/>
+                      <a:ext cx="3060000" cy="3570000"/>
                     </a:xfrm>
                     <a:prstGeom prst="rect"/>
                   </pic:spPr>
@@ -5803,2689 +5803,24 @@
           <w:color w:val="000000"/>
           <w:sz w:val="24"/>
         </w:rPr>
-        <w:t>B. RENCANA PENGELUARAN</w:t>
+        <w:t>B. KETERANGAN PENGELUARAN KEGIATAN</w:t>
       </w:r>
     </w:p>
     <w:p>
       <w:pPr>
-        <w:spacing w:before="160" w:after="40"/>
-        <w:ind w:left="720"/>
+        <w:spacing w:line="360" w:lineRule="auto" w:before="0" w:after="120"/>
+        <w:ind w:left="0" w:firstLine="720"/>
+        <w:jc w:val="both"/>
       </w:pPr>
       <w:r>
         <w:rPr>
           <w:rFonts w:ascii="Times New Roman" w:hAnsi="Times New Roman"/>
-          <w:b/>
-          <w:sz w:val="23"/>
+          <w:color w:val="000000"/>
+          <w:sz w:val="24"/>
         </w:rPr>
-        <w:t>1. Divisi Acara</w:t>
+        <w:t>Dalam penyelenggaraan kegiatan Optik Melawai Goes To Campus (OMGTC) 2026 ini, tidak terdapat rencana pengeluaran dana yang dibebankan kepada kas Badan Eksekutif Mahasiswa Fakultas Ekonomi dan Bisnis (BEM FEB) UKRIDA maupun Fakultas Ekonomi dan Bisnis UKRIDA (Total Pengeluaran BEM FEB: Rp. 0). Seluruh pembiayaan operasional teknis, penyediaan sarana refraksi mata komputerisasi, unit Mobile Optik Bus, kacamata, konsumsi pemateri eksternal, hingga honorarium narasumber ditanggung sepenuhnya secara mandiri oleh pihak mitra pelaksana, yaitu PT. Inti Citra Agung (Optik Melawai).</w:t>
       </w:r>
     </w:p>
-    <w:tbl>
-      <w:tblPr>
-        <w:tblW w:type="auto" w:w="0"/>
-        <w:jc w:val="center"/>
-        <w:tblLayout w:type="fixed"/>
-        <w:tblLook w:firstColumn="1" w:firstRow="1" w:lastColumn="0" w:lastRow="0" w:noHBand="0" w:noVBand="1" w:val="04A0"/>
-        <w:tblBorders>
-          <w:top w:val="single" w:sz="6" w:space="0" w:color="000000"/>
-          <w:left w:val="single" w:sz="6" w:space="0" w:color="000000"/>
-          <w:bottom w:val="single" w:sz="6" w:space="0" w:color="000000"/>
-          <w:right w:val="single" w:sz="6" w:space="0" w:color="000000"/>
-          <w:insideH w:val="single" w:sz="6" w:space="0" w:color="000000"/>
-          <w:insideV w:val="single" w:sz="6" w:space="0" w:color="000000"/>
-        </w:tblBorders>
-        <w:tblCellMar>
-          <w:top w:w="100" w:type="dxa"/>
-          <w:bottom w:w="100" w:type="dxa"/>
-          <w:left w:w="140" w:type="dxa"/>
-          <w:right w:w="140" w:type="dxa"/>
-        </w:tblCellMar>
-      </w:tblPr>
-      <w:tblGrid>
-        <w:gridCol w:w="1587"/>
-        <w:gridCol w:w="1587"/>
-        <w:gridCol w:w="1587"/>
-        <w:gridCol w:w="1587"/>
-        <w:gridCol w:w="1587"/>
-      </w:tblGrid>
-      <w:tr>
-        <w:trPr>
-          <w:cantSplit/>
-          <w:tblHeader/>
-        </w:trPr>
-        <w:tc>
-          <w:tcPr>
-            <w:tcW w:type="dxa" w:w="567"/>
-            <w:shd w:fill="E0E0E0"/>
-          </w:tcPr>
-          <w:p>
-            <w:pPr>
-              <w:spacing w:before="0" w:after="0" w:line="240" w:lineRule="auto"/>
-              <w:jc w:val="center"/>
-            </w:pPr>
-            <w:r>
-              <w:rPr>
-                <w:rFonts w:ascii="Times New Roman" w:hAnsi="Times New Roman"/>
-                <w:b/>
-                <w:color w:val="000000"/>
-                <w:sz w:val="21"/>
-              </w:rPr>
-              <w:t>No</w:t>
-            </w:r>
-          </w:p>
-        </w:tc>
-        <w:tc>
-          <w:tcPr>
-            <w:tcW w:type="dxa" w:w="3288"/>
-            <w:shd w:fill="E0E0E0"/>
-          </w:tcPr>
-          <w:p>
-            <w:pPr>
-              <w:spacing w:before="0" w:after="0" w:line="240" w:lineRule="auto"/>
-              <w:jc w:val="center"/>
-            </w:pPr>
-            <w:r>
-              <w:rPr>
-                <w:rFonts w:ascii="Times New Roman" w:hAnsi="Times New Roman"/>
-                <w:b/>
-                <w:color w:val="000000"/>
-                <w:sz w:val="21"/>
-              </w:rPr>
-              <w:t>Uraian Kebutuhan</w:t>
-            </w:r>
-          </w:p>
-        </w:tc>
-        <w:tc>
-          <w:tcPr>
-            <w:tcW w:type="dxa" w:w="1247"/>
-            <w:shd w:fill="E0E0E0"/>
-          </w:tcPr>
-          <w:p>
-            <w:pPr>
-              <w:spacing w:before="0" w:after="0" w:line="240" w:lineRule="auto"/>
-              <w:jc w:val="center"/>
-            </w:pPr>
-            <w:r>
-              <w:rPr>
-                <w:rFonts w:ascii="Times New Roman" w:hAnsi="Times New Roman"/>
-                <w:b/>
-                <w:color w:val="000000"/>
-                <w:sz w:val="21"/>
-              </w:rPr>
-              <w:t>Qty</w:t>
-            </w:r>
-          </w:p>
-        </w:tc>
-        <w:tc>
-          <w:tcPr>
-            <w:tcW w:type="dxa" w:w="1417"/>
-            <w:shd w:fill="E0E0E0"/>
-          </w:tcPr>
-          <w:p>
-            <w:pPr>
-              <w:spacing w:before="0" w:after="0" w:line="240" w:lineRule="auto"/>
-              <w:jc w:val="center"/>
-            </w:pPr>
-            <w:r>
-              <w:rPr>
-                <w:rFonts w:ascii="Times New Roman" w:hAnsi="Times New Roman"/>
-                <w:b/>
-                <w:color w:val="000000"/>
-                <w:sz w:val="21"/>
-              </w:rPr>
-              <w:t>Harga Satuan</w:t>
-            </w:r>
-          </w:p>
-        </w:tc>
-        <w:tc>
-          <w:tcPr>
-            <w:tcW w:type="dxa" w:w="1417"/>
-            <w:shd w:fill="E0E0E0"/>
-          </w:tcPr>
-          <w:p>
-            <w:pPr>
-              <w:spacing w:before="0" w:after="0" w:line="240" w:lineRule="auto"/>
-              <w:jc w:val="center"/>
-            </w:pPr>
-            <w:r>
-              <w:rPr>
-                <w:rFonts w:ascii="Times New Roman" w:hAnsi="Times New Roman"/>
-                <w:b/>
-                <w:color w:val="000000"/>
-                <w:sz w:val="21"/>
-              </w:rPr>
-              <w:t>Subtotal</w:t>
-            </w:r>
-          </w:p>
-        </w:tc>
-      </w:tr>
-      <w:tr>
-        <w:trPr>
-          <w:cantSplit/>
-        </w:trPr>
-        <w:tc>
-          <w:tcPr>
-            <w:tcW w:type="dxa" w:w="567"/>
-          </w:tcPr>
-          <w:p>
-            <w:pPr>
-              <w:spacing w:before="0" w:after="0" w:line="276" w:lineRule="auto"/>
-              <w:jc w:val="center"/>
-            </w:pPr>
-            <w:r>
-              <w:rPr>
-                <w:rFonts w:ascii="Times New Roman" w:hAnsi="Times New Roman"/>
-                <w:color w:val="000000"/>
-                <w:sz w:val="21"/>
-              </w:rPr>
-              <w:t>1</w:t>
-            </w:r>
-          </w:p>
-        </w:tc>
-        <w:tc>
-          <w:tcPr>
-            <w:tcW w:type="dxa" w:w="3288"/>
-          </w:tcPr>
-          <w:p>
-            <w:pPr>
-              <w:spacing w:before="0" w:after="0" w:line="276" w:lineRule="auto"/>
-              <w:jc w:val="left"/>
-            </w:pPr>
-            <w:r>
-              <w:rPr>
-                <w:rFonts w:ascii="Times New Roman" w:hAnsi="Times New Roman"/>
-                <w:color w:val="000000"/>
-                <w:sz w:val="21"/>
-              </w:rPr>
-              <w:t>Plakat Akrilik Penghargaan Narasumber</w:t>
-            </w:r>
-          </w:p>
-        </w:tc>
-        <w:tc>
-          <w:tcPr>
-            <w:tcW w:type="dxa" w:w="1247"/>
-          </w:tcPr>
-          <w:p>
-            <w:pPr>
-              <w:spacing w:before="0" w:after="0" w:line="276" w:lineRule="auto"/>
-              <w:jc w:val="center"/>
-            </w:pPr>
-            <w:r>
-              <w:rPr>
-                <w:rFonts w:ascii="Times New Roman" w:hAnsi="Times New Roman"/>
-                <w:color w:val="000000"/>
-                <w:sz w:val="21"/>
-              </w:rPr>
-              <w:t>1 buah</w:t>
-            </w:r>
-          </w:p>
-        </w:tc>
-        <w:tc>
-          <w:tcPr>
-            <w:tcW w:type="dxa" w:w="1417"/>
-          </w:tcPr>
-          <w:p>
-            <w:pPr>
-              <w:spacing w:before="0" w:after="0" w:line="276" w:lineRule="auto"/>
-              <w:jc w:val="right"/>
-            </w:pPr>
-            <w:r>
-              <w:rPr>
-                <w:rFonts w:ascii="Times New Roman" w:hAnsi="Times New Roman"/>
-                <w:color w:val="000000"/>
-                <w:sz w:val="21"/>
-              </w:rPr>
-              <w:t>Rp. 250.000</w:t>
-            </w:r>
-          </w:p>
-        </w:tc>
-        <w:tc>
-          <w:tcPr>
-            <w:tcW w:type="dxa" w:w="1417"/>
-          </w:tcPr>
-          <w:p>
-            <w:pPr>
-              <w:spacing w:before="0" w:after="0" w:line="276" w:lineRule="auto"/>
-              <w:jc w:val="right"/>
-            </w:pPr>
-            <w:r>
-              <w:rPr>
-                <w:rFonts w:ascii="Times New Roman" w:hAnsi="Times New Roman"/>
-                <w:color w:val="000000"/>
-                <w:sz w:val="21"/>
-              </w:rPr>
-              <w:t>Rp. 250.000</w:t>
-            </w:r>
-          </w:p>
-        </w:tc>
-      </w:tr>
-      <w:tr>
-        <w:trPr>
-          <w:cantSplit/>
-        </w:trPr>
-        <w:tc>
-          <w:tcPr>
-            <w:tcW w:type="dxa" w:w="567"/>
-          </w:tcPr>
-          <w:p>
-            <w:pPr>
-              <w:spacing w:before="0" w:after="0" w:line="276" w:lineRule="auto"/>
-              <w:jc w:val="center"/>
-            </w:pPr>
-            <w:r>
-              <w:rPr>
-                <w:rFonts w:ascii="Times New Roman" w:hAnsi="Times New Roman"/>
-                <w:color w:val="000000"/>
-                <w:sz w:val="21"/>
-              </w:rPr>
-              <w:t>2</w:t>
-            </w:r>
-          </w:p>
-        </w:tc>
-        <w:tc>
-          <w:tcPr>
-            <w:tcW w:type="dxa" w:w="3288"/>
-          </w:tcPr>
-          <w:p>
-            <w:pPr>
-              <w:spacing w:before="0" w:after="0" w:line="276" w:lineRule="auto"/>
-              <w:jc w:val="left"/>
-            </w:pPr>
-            <w:r>
-              <w:rPr>
-                <w:rFonts w:ascii="Times New Roman" w:hAnsi="Times New Roman"/>
-                <w:color w:val="000000"/>
-                <w:sz w:val="21"/>
-              </w:rPr>
-              <w:t>Paket Cinderamata / Goodie Bag Pemateri &amp; Mitra</w:t>
-            </w:r>
-          </w:p>
-        </w:tc>
-        <w:tc>
-          <w:tcPr>
-            <w:tcW w:type="dxa" w:w="1247"/>
-          </w:tcPr>
-          <w:p>
-            <w:pPr>
-              <w:spacing w:before="0" w:after="0" w:line="276" w:lineRule="auto"/>
-              <w:jc w:val="center"/>
-            </w:pPr>
-            <w:r>
-              <w:rPr>
-                <w:rFonts w:ascii="Times New Roman" w:hAnsi="Times New Roman"/>
-                <w:color w:val="000000"/>
-                <w:sz w:val="21"/>
-              </w:rPr>
-              <w:t>2 paket</w:t>
-            </w:r>
-          </w:p>
-        </w:tc>
-        <w:tc>
-          <w:tcPr>
-            <w:tcW w:type="dxa" w:w="1417"/>
-          </w:tcPr>
-          <w:p>
-            <w:pPr>
-              <w:spacing w:before="0" w:after="0" w:line="276" w:lineRule="auto"/>
-              <w:jc w:val="right"/>
-            </w:pPr>
-            <w:r>
-              <w:rPr>
-                <w:rFonts w:ascii="Times New Roman" w:hAnsi="Times New Roman"/>
-                <w:color w:val="000000"/>
-                <w:sz w:val="21"/>
-              </w:rPr>
-              <w:t>Rp. 150.000</w:t>
-            </w:r>
-          </w:p>
-        </w:tc>
-        <w:tc>
-          <w:tcPr>
-            <w:tcW w:type="dxa" w:w="1417"/>
-          </w:tcPr>
-          <w:p>
-            <w:pPr>
-              <w:spacing w:before="0" w:after="0" w:line="276" w:lineRule="auto"/>
-              <w:jc w:val="right"/>
-            </w:pPr>
-            <w:r>
-              <w:rPr>
-                <w:rFonts w:ascii="Times New Roman" w:hAnsi="Times New Roman"/>
-                <w:color w:val="000000"/>
-                <w:sz w:val="21"/>
-              </w:rPr>
-              <w:t>Rp. 300.000</w:t>
-            </w:r>
-          </w:p>
-        </w:tc>
-      </w:tr>
-      <w:tr>
-        <w:trPr>
-          <w:cantSplit/>
-        </w:trPr>
-        <w:tc>
-          <w:tcPr>
-            <w:tcW w:type="dxa" w:w="567"/>
-          </w:tcPr>
-          <w:p>
-            <w:pPr>
-              <w:spacing w:before="0" w:after="0" w:line="276" w:lineRule="auto"/>
-              <w:jc w:val="center"/>
-            </w:pPr>
-            <w:r>
-              <w:rPr>
-                <w:rFonts w:ascii="Times New Roman" w:hAnsi="Times New Roman"/>
-                <w:color w:val="000000"/>
-                <w:sz w:val="21"/>
-              </w:rPr>
-              <w:t>3</w:t>
-            </w:r>
-          </w:p>
-        </w:tc>
-        <w:tc>
-          <w:tcPr>
-            <w:tcW w:type="dxa" w:w="3288"/>
-          </w:tcPr>
-          <w:p>
-            <w:pPr>
-              <w:spacing w:before="0" w:after="0" w:line="276" w:lineRule="auto"/>
-              <w:jc w:val="left"/>
-            </w:pPr>
-            <w:r>
-              <w:rPr>
-                <w:rFonts w:ascii="Times New Roman" w:hAnsi="Times New Roman"/>
-                <w:color w:val="000000"/>
-                <w:sz w:val="21"/>
-              </w:rPr>
-              <w:t>Cetak Sertifikat Kertas Linen &amp; Map Panitia/Peserta</w:t>
-            </w:r>
-          </w:p>
-        </w:tc>
-        <w:tc>
-          <w:tcPr>
-            <w:tcW w:type="dxa" w:w="1247"/>
-          </w:tcPr>
-          <w:p>
-            <w:pPr>
-              <w:spacing w:before="0" w:after="0" w:line="276" w:lineRule="auto"/>
-              <w:jc w:val="center"/>
-            </w:pPr>
-            <w:r>
-              <w:rPr>
-                <w:rFonts w:ascii="Times New Roman" w:hAnsi="Times New Roman"/>
-                <w:color w:val="000000"/>
-                <w:sz w:val="21"/>
-              </w:rPr>
-              <w:t>40 lembar</w:t>
-            </w:r>
-          </w:p>
-        </w:tc>
-        <w:tc>
-          <w:tcPr>
-            <w:tcW w:type="dxa" w:w="1417"/>
-          </w:tcPr>
-          <w:p>
-            <w:pPr>
-              <w:spacing w:before="0" w:after="0" w:line="276" w:lineRule="auto"/>
-              <w:jc w:val="right"/>
-            </w:pPr>
-            <w:r>
-              <w:rPr>
-                <w:rFonts w:ascii="Times New Roman" w:hAnsi="Times New Roman"/>
-                <w:color w:val="000000"/>
-                <w:sz w:val="21"/>
-              </w:rPr>
-              <w:t>Rp. 5.000</w:t>
-            </w:r>
-          </w:p>
-        </w:tc>
-        <w:tc>
-          <w:tcPr>
-            <w:tcW w:type="dxa" w:w="1417"/>
-          </w:tcPr>
-          <w:p>
-            <w:pPr>
-              <w:spacing w:before="0" w:after="0" w:line="276" w:lineRule="auto"/>
-              <w:jc w:val="right"/>
-            </w:pPr>
-            <w:r>
-              <w:rPr>
-                <w:rFonts w:ascii="Times New Roman" w:hAnsi="Times New Roman"/>
-                <w:color w:val="000000"/>
-                <w:sz w:val="21"/>
-              </w:rPr>
-              <w:t>Rp. 200.000</w:t>
-            </w:r>
-          </w:p>
-        </w:tc>
-      </w:tr>
-      <w:tr>
-        <w:trPr>
-          <w:cantSplit/>
-        </w:trPr>
-        <w:tc>
-          <w:tcPr>
-            <w:tcW w:type="dxa" w:w="567"/>
-          </w:tcPr>
-          <w:p>
-            <w:pPr>
-              <w:spacing w:before="0" w:after="0" w:line="276" w:lineRule="auto"/>
-              <w:jc w:val="center"/>
-            </w:pPr>
-            <w:r>
-              <w:rPr>
-                <w:rFonts w:ascii="Times New Roman" w:hAnsi="Times New Roman"/>
-                <w:b/>
-                <w:color w:val="000000"/>
-                <w:sz w:val="21"/>
-              </w:rPr>
-            </w:r>
-          </w:p>
-        </w:tc>
-        <w:tc>
-          <w:tcPr>
-            <w:tcW w:type="dxa" w:w="3288"/>
-          </w:tcPr>
-          <w:p>
-            <w:pPr>
-              <w:spacing w:before="0" w:after="0" w:line="276" w:lineRule="auto"/>
-              <w:jc w:val="left"/>
-            </w:pPr>
-            <w:r>
-              <w:rPr>
-                <w:rFonts w:ascii="Times New Roman" w:hAnsi="Times New Roman"/>
-                <w:b/>
-                <w:color w:val="000000"/>
-                <w:sz w:val="21"/>
-              </w:rPr>
-              <w:t>TOTAL DIVISI ACARA</w:t>
-            </w:r>
-          </w:p>
-        </w:tc>
-        <w:tc>
-          <w:tcPr>
-            <w:tcW w:type="dxa" w:w="1247"/>
-          </w:tcPr>
-          <w:p>
-            <w:pPr>
-              <w:spacing w:before="0" w:after="0" w:line="276" w:lineRule="auto"/>
-              <w:jc w:val="center"/>
-            </w:pPr>
-            <w:r>
-              <w:rPr>
-                <w:rFonts w:ascii="Times New Roman" w:hAnsi="Times New Roman"/>
-                <w:b/>
-                <w:color w:val="000000"/>
-                <w:sz w:val="21"/>
-              </w:rPr>
-            </w:r>
-          </w:p>
-        </w:tc>
-        <w:tc>
-          <w:tcPr>
-            <w:tcW w:type="dxa" w:w="1417"/>
-          </w:tcPr>
-          <w:p>
-            <w:pPr>
-              <w:spacing w:before="0" w:after="0" w:line="276" w:lineRule="auto"/>
-              <w:jc w:val="right"/>
-            </w:pPr>
-            <w:r>
-              <w:rPr>
-                <w:rFonts w:ascii="Times New Roman" w:hAnsi="Times New Roman"/>
-                <w:b/>
-                <w:color w:val="000000"/>
-                <w:sz w:val="21"/>
-              </w:rPr>
-            </w:r>
-          </w:p>
-        </w:tc>
-        <w:tc>
-          <w:tcPr>
-            <w:tcW w:type="dxa" w:w="1417"/>
-          </w:tcPr>
-          <w:p>
-            <w:pPr>
-              <w:spacing w:before="0" w:after="0" w:line="276" w:lineRule="auto"/>
-              <w:jc w:val="right"/>
-            </w:pPr>
-            <w:r>
-              <w:rPr>
-                <w:rFonts w:ascii="Times New Roman" w:hAnsi="Times New Roman"/>
-                <w:b/>
-                <w:color w:val="000000"/>
-                <w:sz w:val="21"/>
-              </w:rPr>
-              <w:t>Rp. 750.000</w:t>
-            </w:r>
-          </w:p>
-        </w:tc>
-      </w:tr>
-    </w:tbl>
-    <w:p>
-      <w:pPr>
-        <w:spacing w:before="160" w:after="40"/>
-        <w:ind w:left="720"/>
-      </w:pPr>
-      <w:r>
-        <w:rPr>
-          <w:rFonts w:ascii="Times New Roman" w:hAnsi="Times New Roman"/>
-          <w:b/>
-          <w:sz w:val="23"/>
-        </w:rPr>
-        <w:t>2. Divisi Konsumsi</w:t>
-      </w:r>
-    </w:p>
-    <w:tbl>
-      <w:tblPr>
-        <w:tblW w:type="auto" w:w="0"/>
-        <w:jc w:val="center"/>
-        <w:tblLayout w:type="fixed"/>
-        <w:tblLook w:firstColumn="1" w:firstRow="1" w:lastColumn="0" w:lastRow="0" w:noHBand="0" w:noVBand="1" w:val="04A0"/>
-        <w:tblBorders>
-          <w:top w:val="single" w:sz="6" w:space="0" w:color="000000"/>
-          <w:left w:val="single" w:sz="6" w:space="0" w:color="000000"/>
-          <w:bottom w:val="single" w:sz="6" w:space="0" w:color="000000"/>
-          <w:right w:val="single" w:sz="6" w:space="0" w:color="000000"/>
-          <w:insideH w:val="single" w:sz="6" w:space="0" w:color="000000"/>
-          <w:insideV w:val="single" w:sz="6" w:space="0" w:color="000000"/>
-        </w:tblBorders>
-        <w:tblCellMar>
-          <w:top w:w="100" w:type="dxa"/>
-          <w:bottom w:w="100" w:type="dxa"/>
-          <w:left w:w="140" w:type="dxa"/>
-          <w:right w:w="140" w:type="dxa"/>
-        </w:tblCellMar>
-      </w:tblPr>
-      <w:tblGrid>
-        <w:gridCol w:w="1587"/>
-        <w:gridCol w:w="1587"/>
-        <w:gridCol w:w="1587"/>
-        <w:gridCol w:w="1587"/>
-        <w:gridCol w:w="1587"/>
-      </w:tblGrid>
-      <w:tr>
-        <w:trPr>
-          <w:cantSplit/>
-          <w:tblHeader/>
-        </w:trPr>
-        <w:tc>
-          <w:tcPr>
-            <w:tcW w:type="dxa" w:w="567"/>
-            <w:shd w:fill="E0E0E0"/>
-          </w:tcPr>
-          <w:p>
-            <w:pPr>
-              <w:spacing w:before="0" w:after="0" w:line="240" w:lineRule="auto"/>
-              <w:jc w:val="center"/>
-            </w:pPr>
-            <w:r>
-              <w:rPr>
-                <w:rFonts w:ascii="Times New Roman" w:hAnsi="Times New Roman"/>
-                <w:b/>
-                <w:color w:val="000000"/>
-                <w:sz w:val="21"/>
-              </w:rPr>
-              <w:t>No</w:t>
-            </w:r>
-          </w:p>
-        </w:tc>
-        <w:tc>
-          <w:tcPr>
-            <w:tcW w:type="dxa" w:w="3288"/>
-            <w:shd w:fill="E0E0E0"/>
-          </w:tcPr>
-          <w:p>
-            <w:pPr>
-              <w:spacing w:before="0" w:after="0" w:line="240" w:lineRule="auto"/>
-              <w:jc w:val="center"/>
-            </w:pPr>
-            <w:r>
-              <w:rPr>
-                <w:rFonts w:ascii="Times New Roman" w:hAnsi="Times New Roman"/>
-                <w:b/>
-                <w:color w:val="000000"/>
-                <w:sz w:val="21"/>
-              </w:rPr>
-              <w:t>Uraian Kebutuhan</w:t>
-            </w:r>
-          </w:p>
-        </w:tc>
-        <w:tc>
-          <w:tcPr>
-            <w:tcW w:type="dxa" w:w="1247"/>
-            <w:shd w:fill="E0E0E0"/>
-          </w:tcPr>
-          <w:p>
-            <w:pPr>
-              <w:spacing w:before="0" w:after="0" w:line="240" w:lineRule="auto"/>
-              <w:jc w:val="center"/>
-            </w:pPr>
-            <w:r>
-              <w:rPr>
-                <w:rFonts w:ascii="Times New Roman" w:hAnsi="Times New Roman"/>
-                <w:b/>
-                <w:color w:val="000000"/>
-                <w:sz w:val="21"/>
-              </w:rPr>
-              <w:t>Qty</w:t>
-            </w:r>
-          </w:p>
-        </w:tc>
-        <w:tc>
-          <w:tcPr>
-            <w:tcW w:type="dxa" w:w="1417"/>
-            <w:shd w:fill="E0E0E0"/>
-          </w:tcPr>
-          <w:p>
-            <w:pPr>
-              <w:spacing w:before="0" w:after="0" w:line="240" w:lineRule="auto"/>
-              <w:jc w:val="center"/>
-            </w:pPr>
-            <w:r>
-              <w:rPr>
-                <w:rFonts w:ascii="Times New Roman" w:hAnsi="Times New Roman"/>
-                <w:b/>
-                <w:color w:val="000000"/>
-                <w:sz w:val="21"/>
-              </w:rPr>
-              <w:t>Harga Satuan</w:t>
-            </w:r>
-          </w:p>
-        </w:tc>
-        <w:tc>
-          <w:tcPr>
-            <w:tcW w:type="dxa" w:w="1417"/>
-            <w:shd w:fill="E0E0E0"/>
-          </w:tcPr>
-          <w:p>
-            <w:pPr>
-              <w:spacing w:before="0" w:after="0" w:line="240" w:lineRule="auto"/>
-              <w:jc w:val="center"/>
-            </w:pPr>
-            <w:r>
-              <w:rPr>
-                <w:rFonts w:ascii="Times New Roman" w:hAnsi="Times New Roman"/>
-                <w:b/>
-                <w:color w:val="000000"/>
-                <w:sz w:val="21"/>
-              </w:rPr>
-              <w:t>Subtotal</w:t>
-            </w:r>
-          </w:p>
-        </w:tc>
-      </w:tr>
-      <w:tr>
-        <w:trPr>
-          <w:cantSplit/>
-        </w:trPr>
-        <w:tc>
-          <w:tcPr>
-            <w:tcW w:type="dxa" w:w="567"/>
-          </w:tcPr>
-          <w:p>
-            <w:pPr>
-              <w:spacing w:before="0" w:after="0" w:line="276" w:lineRule="auto"/>
-              <w:jc w:val="center"/>
-            </w:pPr>
-            <w:r>
-              <w:rPr>
-                <w:rFonts w:ascii="Times New Roman" w:hAnsi="Times New Roman"/>
-                <w:color w:val="000000"/>
-                <w:sz w:val="21"/>
-              </w:rPr>
-              <w:t>1</w:t>
-            </w:r>
-          </w:p>
-        </w:tc>
-        <w:tc>
-          <w:tcPr>
-            <w:tcW w:type="dxa" w:w="3288"/>
-          </w:tcPr>
-          <w:p>
-            <w:pPr>
-              <w:spacing w:before="0" w:after="0" w:line="276" w:lineRule="auto"/>
-              <w:jc w:val="left"/>
-            </w:pPr>
-            <w:r>
-              <w:rPr>
-                <w:rFonts w:ascii="Times New Roman" w:hAnsi="Times New Roman"/>
-                <w:color w:val="000000"/>
-                <w:sz w:val="21"/>
-              </w:rPr>
-              <w:t>Snack Box Narasumber &amp; Tamu Khusus</w:t>
-            </w:r>
-          </w:p>
-        </w:tc>
-        <w:tc>
-          <w:tcPr>
-            <w:tcW w:type="dxa" w:w="1247"/>
-          </w:tcPr>
-          <w:p>
-            <w:pPr>
-              <w:spacing w:before="0" w:after="0" w:line="276" w:lineRule="auto"/>
-              <w:jc w:val="center"/>
-            </w:pPr>
-            <w:r>
-              <w:rPr>
-                <w:rFonts w:ascii="Times New Roman" w:hAnsi="Times New Roman"/>
-                <w:color w:val="000000"/>
-                <w:sz w:val="21"/>
-              </w:rPr>
-              <w:t>10 box</w:t>
-            </w:r>
-          </w:p>
-        </w:tc>
-        <w:tc>
-          <w:tcPr>
-            <w:tcW w:type="dxa" w:w="1417"/>
-          </w:tcPr>
-          <w:p>
-            <w:pPr>
-              <w:spacing w:before="0" w:after="0" w:line="276" w:lineRule="auto"/>
-              <w:jc w:val="right"/>
-            </w:pPr>
-            <w:r>
-              <w:rPr>
-                <w:rFonts w:ascii="Times New Roman" w:hAnsi="Times New Roman"/>
-                <w:color w:val="000000"/>
-                <w:sz w:val="21"/>
-              </w:rPr>
-              <w:t>Rp. 25.000</w:t>
-            </w:r>
-          </w:p>
-        </w:tc>
-        <w:tc>
-          <w:tcPr>
-            <w:tcW w:type="dxa" w:w="1417"/>
-          </w:tcPr>
-          <w:p>
-            <w:pPr>
-              <w:spacing w:before="0" w:after="0" w:line="276" w:lineRule="auto"/>
-              <w:jc w:val="right"/>
-            </w:pPr>
-            <w:r>
-              <w:rPr>
-                <w:rFonts w:ascii="Times New Roman" w:hAnsi="Times New Roman"/>
-                <w:color w:val="000000"/>
-                <w:sz w:val="21"/>
-              </w:rPr>
-              <w:t>Rp. 250.000</w:t>
-            </w:r>
-          </w:p>
-        </w:tc>
-      </w:tr>
-      <w:tr>
-        <w:trPr>
-          <w:cantSplit/>
-        </w:trPr>
-        <w:tc>
-          <w:tcPr>
-            <w:tcW w:type="dxa" w:w="567"/>
-          </w:tcPr>
-          <w:p>
-            <w:pPr>
-              <w:spacing w:before="0" w:after="0" w:line="276" w:lineRule="auto"/>
-              <w:jc w:val="center"/>
-            </w:pPr>
-            <w:r>
-              <w:rPr>
-                <w:rFonts w:ascii="Times New Roman" w:hAnsi="Times New Roman"/>
-                <w:color w:val="000000"/>
-                <w:sz w:val="21"/>
-              </w:rPr>
-              <w:t>2</w:t>
-            </w:r>
-          </w:p>
-        </w:tc>
-        <w:tc>
-          <w:tcPr>
-            <w:tcW w:type="dxa" w:w="3288"/>
-          </w:tcPr>
-          <w:p>
-            <w:pPr>
-              <w:spacing w:before="0" w:after="0" w:line="276" w:lineRule="auto"/>
-              <w:jc w:val="left"/>
-            </w:pPr>
-            <w:r>
-              <w:rPr>
-                <w:rFonts w:ascii="Times New Roman" w:hAnsi="Times New Roman"/>
-                <w:color w:val="000000"/>
-                <w:sz w:val="21"/>
-              </w:rPr>
-              <w:t>Makan Siang Panitia Pelaksana (2 Hari)</w:t>
-            </w:r>
-          </w:p>
-        </w:tc>
-        <w:tc>
-          <w:tcPr>
-            <w:tcW w:type="dxa" w:w="1247"/>
-          </w:tcPr>
-          <w:p>
-            <w:pPr>
-              <w:spacing w:before="0" w:after="0" w:line="276" w:lineRule="auto"/>
-              <w:jc w:val="center"/>
-            </w:pPr>
-            <w:r>
-              <w:rPr>
-                <w:rFonts w:ascii="Times New Roman" w:hAnsi="Times New Roman"/>
-                <w:color w:val="000000"/>
-                <w:sz w:val="21"/>
-              </w:rPr>
-              <w:t>32 porsi</w:t>
-            </w:r>
-          </w:p>
-        </w:tc>
-        <w:tc>
-          <w:tcPr>
-            <w:tcW w:type="dxa" w:w="1417"/>
-          </w:tcPr>
-          <w:p>
-            <w:pPr>
-              <w:spacing w:before="0" w:after="0" w:line="276" w:lineRule="auto"/>
-              <w:jc w:val="right"/>
-            </w:pPr>
-            <w:r>
-              <w:rPr>
-                <w:rFonts w:ascii="Times New Roman" w:hAnsi="Times New Roman"/>
-                <w:color w:val="000000"/>
-                <w:sz w:val="21"/>
-              </w:rPr>
-              <w:t>Rp. 25.000</w:t>
-            </w:r>
-          </w:p>
-        </w:tc>
-        <w:tc>
-          <w:tcPr>
-            <w:tcW w:type="dxa" w:w="1417"/>
-          </w:tcPr>
-          <w:p>
-            <w:pPr>
-              <w:spacing w:before="0" w:after="0" w:line="276" w:lineRule="auto"/>
-              <w:jc w:val="right"/>
-            </w:pPr>
-            <w:r>
-              <w:rPr>
-                <w:rFonts w:ascii="Times New Roman" w:hAnsi="Times New Roman"/>
-                <w:color w:val="000000"/>
-                <w:sz w:val="21"/>
-              </w:rPr>
-              <w:t>Rp. 800.000</w:t>
-            </w:r>
-          </w:p>
-        </w:tc>
-      </w:tr>
-      <w:tr>
-        <w:trPr>
-          <w:cantSplit/>
-        </w:trPr>
-        <w:tc>
-          <w:tcPr>
-            <w:tcW w:type="dxa" w:w="567"/>
-          </w:tcPr>
-          <w:p>
-            <w:pPr>
-              <w:spacing w:before="0" w:after="0" w:line="276" w:lineRule="auto"/>
-              <w:jc w:val="center"/>
-            </w:pPr>
-            <w:r>
-              <w:rPr>
-                <w:rFonts w:ascii="Times New Roman" w:hAnsi="Times New Roman"/>
-                <w:b/>
-                <w:color w:val="000000"/>
-                <w:sz w:val="21"/>
-              </w:rPr>
-            </w:r>
-          </w:p>
-        </w:tc>
-        <w:tc>
-          <w:tcPr>
-            <w:tcW w:type="dxa" w:w="3288"/>
-          </w:tcPr>
-          <w:p>
-            <w:pPr>
-              <w:spacing w:before="0" w:after="0" w:line="276" w:lineRule="auto"/>
-              <w:jc w:val="left"/>
-            </w:pPr>
-            <w:r>
-              <w:rPr>
-                <w:rFonts w:ascii="Times New Roman" w:hAnsi="Times New Roman"/>
-                <w:b/>
-                <w:color w:val="000000"/>
-                <w:sz w:val="21"/>
-              </w:rPr>
-              <w:t>TOTAL DIVISI KONSUMSI</w:t>
-            </w:r>
-          </w:p>
-        </w:tc>
-        <w:tc>
-          <w:tcPr>
-            <w:tcW w:type="dxa" w:w="1247"/>
-          </w:tcPr>
-          <w:p>
-            <w:pPr>
-              <w:spacing w:before="0" w:after="0" w:line="276" w:lineRule="auto"/>
-              <w:jc w:val="center"/>
-            </w:pPr>
-            <w:r>
-              <w:rPr>
-                <w:rFonts w:ascii="Times New Roman" w:hAnsi="Times New Roman"/>
-                <w:b/>
-                <w:color w:val="000000"/>
-                <w:sz w:val="21"/>
-              </w:rPr>
-            </w:r>
-          </w:p>
-        </w:tc>
-        <w:tc>
-          <w:tcPr>
-            <w:tcW w:type="dxa" w:w="1417"/>
-          </w:tcPr>
-          <w:p>
-            <w:pPr>
-              <w:spacing w:before="0" w:after="0" w:line="276" w:lineRule="auto"/>
-              <w:jc w:val="right"/>
-            </w:pPr>
-            <w:r>
-              <w:rPr>
-                <w:rFonts w:ascii="Times New Roman" w:hAnsi="Times New Roman"/>
-                <w:b/>
-                <w:color w:val="000000"/>
-                <w:sz w:val="21"/>
-              </w:rPr>
-            </w:r>
-          </w:p>
-        </w:tc>
-        <w:tc>
-          <w:tcPr>
-            <w:tcW w:type="dxa" w:w="1417"/>
-          </w:tcPr>
-          <w:p>
-            <w:pPr>
-              <w:spacing w:before="0" w:after="0" w:line="276" w:lineRule="auto"/>
-              <w:jc w:val="right"/>
-            </w:pPr>
-            <w:r>
-              <w:rPr>
-                <w:rFonts w:ascii="Times New Roman" w:hAnsi="Times New Roman"/>
-                <w:b/>
-                <w:color w:val="000000"/>
-                <w:sz w:val="21"/>
-              </w:rPr>
-              <w:t>Rp. 1.050.000</w:t>
-            </w:r>
-          </w:p>
-        </w:tc>
-      </w:tr>
-    </w:tbl>
-    <w:p>
-      <w:pPr>
-        <w:spacing w:before="160" w:after="40"/>
-        <w:ind w:left="720"/>
-      </w:pPr>
-      <w:r>
-        <w:rPr>
-          <w:rFonts w:ascii="Times New Roman" w:hAnsi="Times New Roman"/>
-          <w:b/>
-          <w:sz w:val="23"/>
-        </w:rPr>
-        <w:t>3. Divisi Publikasi dan Dokumentasi (Pubdok)</w:t>
-      </w:r>
-    </w:p>
-    <w:tbl>
-      <w:tblPr>
-        <w:tblW w:type="auto" w:w="0"/>
-        <w:jc w:val="center"/>
-        <w:tblLayout w:type="fixed"/>
-        <w:tblLook w:firstColumn="1" w:firstRow="1" w:lastColumn="0" w:lastRow="0" w:noHBand="0" w:noVBand="1" w:val="04A0"/>
-        <w:tblBorders>
-          <w:top w:val="single" w:sz="6" w:space="0" w:color="000000"/>
-          <w:left w:val="single" w:sz="6" w:space="0" w:color="000000"/>
-          <w:bottom w:val="single" w:sz="6" w:space="0" w:color="000000"/>
-          <w:right w:val="single" w:sz="6" w:space="0" w:color="000000"/>
-          <w:insideH w:val="single" w:sz="6" w:space="0" w:color="000000"/>
-          <w:insideV w:val="single" w:sz="6" w:space="0" w:color="000000"/>
-        </w:tblBorders>
-        <w:tblCellMar>
-          <w:top w:w="100" w:type="dxa"/>
-          <w:bottom w:w="100" w:type="dxa"/>
-          <w:left w:w="140" w:type="dxa"/>
-          <w:right w:w="140" w:type="dxa"/>
-        </w:tblCellMar>
-      </w:tblPr>
-      <w:tblGrid>
-        <w:gridCol w:w="1587"/>
-        <w:gridCol w:w="1587"/>
-        <w:gridCol w:w="1587"/>
-        <w:gridCol w:w="1587"/>
-        <w:gridCol w:w="1587"/>
-      </w:tblGrid>
-      <w:tr>
-        <w:trPr>
-          <w:cantSplit/>
-          <w:tblHeader/>
-        </w:trPr>
-        <w:tc>
-          <w:tcPr>
-            <w:tcW w:type="dxa" w:w="567"/>
-            <w:shd w:fill="E0E0E0"/>
-          </w:tcPr>
-          <w:p>
-            <w:pPr>
-              <w:spacing w:before="0" w:after="0" w:line="240" w:lineRule="auto"/>
-              <w:jc w:val="center"/>
-            </w:pPr>
-            <w:r>
-              <w:rPr>
-                <w:rFonts w:ascii="Times New Roman" w:hAnsi="Times New Roman"/>
-                <w:b/>
-                <w:color w:val="000000"/>
-                <w:sz w:val="21"/>
-              </w:rPr>
-              <w:t>No</w:t>
-            </w:r>
-          </w:p>
-        </w:tc>
-        <w:tc>
-          <w:tcPr>
-            <w:tcW w:type="dxa" w:w="3288"/>
-            <w:shd w:fill="E0E0E0"/>
-          </w:tcPr>
-          <w:p>
-            <w:pPr>
-              <w:spacing w:before="0" w:after="0" w:line="240" w:lineRule="auto"/>
-              <w:jc w:val="center"/>
-            </w:pPr>
-            <w:r>
-              <w:rPr>
-                <w:rFonts w:ascii="Times New Roman" w:hAnsi="Times New Roman"/>
-                <w:b/>
-                <w:color w:val="000000"/>
-                <w:sz w:val="21"/>
-              </w:rPr>
-              <w:t>Uraian Kebutuhan</w:t>
-            </w:r>
-          </w:p>
-        </w:tc>
-        <w:tc>
-          <w:tcPr>
-            <w:tcW w:type="dxa" w:w="1247"/>
-            <w:shd w:fill="E0E0E0"/>
-          </w:tcPr>
-          <w:p>
-            <w:pPr>
-              <w:spacing w:before="0" w:after="0" w:line="240" w:lineRule="auto"/>
-              <w:jc w:val="center"/>
-            </w:pPr>
-            <w:r>
-              <w:rPr>
-                <w:rFonts w:ascii="Times New Roman" w:hAnsi="Times New Roman"/>
-                <w:b/>
-                <w:color w:val="000000"/>
-                <w:sz w:val="21"/>
-              </w:rPr>
-              <w:t>Qty</w:t>
-            </w:r>
-          </w:p>
-        </w:tc>
-        <w:tc>
-          <w:tcPr>
-            <w:tcW w:type="dxa" w:w="1417"/>
-            <w:shd w:fill="E0E0E0"/>
-          </w:tcPr>
-          <w:p>
-            <w:pPr>
-              <w:spacing w:before="0" w:after="0" w:line="240" w:lineRule="auto"/>
-              <w:jc w:val="center"/>
-            </w:pPr>
-            <w:r>
-              <w:rPr>
-                <w:rFonts w:ascii="Times New Roman" w:hAnsi="Times New Roman"/>
-                <w:b/>
-                <w:color w:val="000000"/>
-                <w:sz w:val="21"/>
-              </w:rPr>
-              <w:t>Harga Satuan</w:t>
-            </w:r>
-          </w:p>
-        </w:tc>
-        <w:tc>
-          <w:tcPr>
-            <w:tcW w:type="dxa" w:w="1417"/>
-            <w:shd w:fill="E0E0E0"/>
-          </w:tcPr>
-          <w:p>
-            <w:pPr>
-              <w:spacing w:before="0" w:after="0" w:line="240" w:lineRule="auto"/>
-              <w:jc w:val="center"/>
-            </w:pPr>
-            <w:r>
-              <w:rPr>
-                <w:rFonts w:ascii="Times New Roman" w:hAnsi="Times New Roman"/>
-                <w:b/>
-                <w:color w:val="000000"/>
-                <w:sz w:val="21"/>
-              </w:rPr>
-              <w:t>Subtotal</w:t>
-            </w:r>
-          </w:p>
-        </w:tc>
-      </w:tr>
-      <w:tr>
-        <w:trPr>
-          <w:cantSplit/>
-        </w:trPr>
-        <w:tc>
-          <w:tcPr>
-            <w:tcW w:type="dxa" w:w="567"/>
-          </w:tcPr>
-          <w:p>
-            <w:pPr>
-              <w:spacing w:before="0" w:after="0" w:line="276" w:lineRule="auto"/>
-              <w:jc w:val="center"/>
-            </w:pPr>
-            <w:r>
-              <w:rPr>
-                <w:rFonts w:ascii="Times New Roman" w:hAnsi="Times New Roman"/>
-                <w:color w:val="000000"/>
-                <w:sz w:val="21"/>
-              </w:rPr>
-              <w:t>1</w:t>
-            </w:r>
-          </w:p>
-        </w:tc>
-        <w:tc>
-          <w:tcPr>
-            <w:tcW w:type="dxa" w:w="3288"/>
-          </w:tcPr>
-          <w:p>
-            <w:pPr>
-              <w:spacing w:before="0" w:after="0" w:line="276" w:lineRule="auto"/>
-              <w:jc w:val="left"/>
-            </w:pPr>
-            <w:r>
-              <w:rPr>
-                <w:rFonts w:ascii="Times New Roman" w:hAnsi="Times New Roman"/>
-                <w:color w:val="000000"/>
-                <w:sz w:val="21"/>
-              </w:rPr>
-              <w:t>Cetak Backdrop Panggung Auditorium (Ukuran 4 x 2 m)</w:t>
-            </w:r>
-          </w:p>
-        </w:tc>
-        <w:tc>
-          <w:tcPr>
-            <w:tcW w:type="dxa" w:w="1247"/>
-          </w:tcPr>
-          <w:p>
-            <w:pPr>
-              <w:spacing w:before="0" w:after="0" w:line="276" w:lineRule="auto"/>
-              <w:jc w:val="center"/>
-            </w:pPr>
-            <w:r>
-              <w:rPr>
-                <w:rFonts w:ascii="Times New Roman" w:hAnsi="Times New Roman"/>
-                <w:color w:val="000000"/>
-                <w:sz w:val="21"/>
-              </w:rPr>
-              <w:t>1 buah</w:t>
-            </w:r>
-          </w:p>
-        </w:tc>
-        <w:tc>
-          <w:tcPr>
-            <w:tcW w:type="dxa" w:w="1417"/>
-          </w:tcPr>
-          <w:p>
-            <w:pPr>
-              <w:spacing w:before="0" w:after="0" w:line="276" w:lineRule="auto"/>
-              <w:jc w:val="right"/>
-            </w:pPr>
-            <w:r>
-              <w:rPr>
-                <w:rFonts w:ascii="Times New Roman" w:hAnsi="Times New Roman"/>
-                <w:color w:val="000000"/>
-                <w:sz w:val="21"/>
-              </w:rPr>
-              <w:t>Rp. 250.000</w:t>
-            </w:r>
-          </w:p>
-        </w:tc>
-        <w:tc>
-          <w:tcPr>
-            <w:tcW w:type="dxa" w:w="1417"/>
-          </w:tcPr>
-          <w:p>
-            <w:pPr>
-              <w:spacing w:before="0" w:after="0" w:line="276" w:lineRule="auto"/>
-              <w:jc w:val="right"/>
-            </w:pPr>
-            <w:r>
-              <w:rPr>
-                <w:rFonts w:ascii="Times New Roman" w:hAnsi="Times New Roman"/>
-                <w:color w:val="000000"/>
-                <w:sz w:val="21"/>
-              </w:rPr>
-              <w:t>Rp. 250.000</w:t>
-            </w:r>
-          </w:p>
-        </w:tc>
-      </w:tr>
-      <w:tr>
-        <w:trPr>
-          <w:cantSplit/>
-        </w:trPr>
-        <w:tc>
-          <w:tcPr>
-            <w:tcW w:type="dxa" w:w="567"/>
-          </w:tcPr>
-          <w:p>
-            <w:pPr>
-              <w:spacing w:before="0" w:after="0" w:line="276" w:lineRule="auto"/>
-              <w:jc w:val="center"/>
-            </w:pPr>
-            <w:r>
-              <w:rPr>
-                <w:rFonts w:ascii="Times New Roman" w:hAnsi="Times New Roman"/>
-                <w:color w:val="000000"/>
-                <w:sz w:val="21"/>
-              </w:rPr>
-              <w:t>2</w:t>
-            </w:r>
-          </w:p>
-        </w:tc>
-        <w:tc>
-          <w:tcPr>
-            <w:tcW w:type="dxa" w:w="3288"/>
-          </w:tcPr>
-          <w:p>
-            <w:pPr>
-              <w:spacing w:before="0" w:after="0" w:line="276" w:lineRule="auto"/>
-              <w:jc w:val="left"/>
-            </w:pPr>
-            <w:r>
-              <w:rPr>
-                <w:rFonts w:ascii="Times New Roman" w:hAnsi="Times New Roman"/>
-                <w:color w:val="000000"/>
-                <w:sz w:val="21"/>
-              </w:rPr>
-              <w:t>Cetak Standing Banner / X-Banner Edukasi &amp; Petunjuk</w:t>
-            </w:r>
-          </w:p>
-        </w:tc>
-        <w:tc>
-          <w:tcPr>
-            <w:tcW w:type="dxa" w:w="1247"/>
-          </w:tcPr>
-          <w:p>
-            <w:pPr>
-              <w:spacing w:before="0" w:after="0" w:line="276" w:lineRule="auto"/>
-              <w:jc w:val="center"/>
-            </w:pPr>
-            <w:r>
-              <w:rPr>
-                <w:rFonts w:ascii="Times New Roman" w:hAnsi="Times New Roman"/>
-                <w:color w:val="000000"/>
-                <w:sz w:val="21"/>
-              </w:rPr>
-              <w:t>2 buah</w:t>
-            </w:r>
-          </w:p>
-        </w:tc>
-        <w:tc>
-          <w:tcPr>
-            <w:tcW w:type="dxa" w:w="1417"/>
-          </w:tcPr>
-          <w:p>
-            <w:pPr>
-              <w:spacing w:before="0" w:after="0" w:line="276" w:lineRule="auto"/>
-              <w:jc w:val="right"/>
-            </w:pPr>
-            <w:r>
-              <w:rPr>
-                <w:rFonts w:ascii="Times New Roman" w:hAnsi="Times New Roman"/>
-                <w:color w:val="000000"/>
-                <w:sz w:val="21"/>
-              </w:rPr>
-              <w:t>Rp. 100.000</w:t>
-            </w:r>
-          </w:p>
-        </w:tc>
-        <w:tc>
-          <w:tcPr>
-            <w:tcW w:type="dxa" w:w="1417"/>
-          </w:tcPr>
-          <w:p>
-            <w:pPr>
-              <w:spacing w:before="0" w:after="0" w:line="276" w:lineRule="auto"/>
-              <w:jc w:val="right"/>
-            </w:pPr>
-            <w:r>
-              <w:rPr>
-                <w:rFonts w:ascii="Times New Roman" w:hAnsi="Times New Roman"/>
-                <w:color w:val="000000"/>
-                <w:sz w:val="21"/>
-              </w:rPr>
-              <w:t>Rp. 200.000</w:t>
-            </w:r>
-          </w:p>
-        </w:tc>
-      </w:tr>
-      <w:tr>
-        <w:trPr>
-          <w:cantSplit/>
-        </w:trPr>
-        <w:tc>
-          <w:tcPr>
-            <w:tcW w:type="dxa" w:w="567"/>
-          </w:tcPr>
-          <w:p>
-            <w:pPr>
-              <w:spacing w:before="0" w:after="0" w:line="276" w:lineRule="auto"/>
-              <w:jc w:val="center"/>
-            </w:pPr>
-            <w:r>
-              <w:rPr>
-                <w:rFonts w:ascii="Times New Roman" w:hAnsi="Times New Roman"/>
-                <w:color w:val="000000"/>
-                <w:sz w:val="21"/>
-              </w:rPr>
-              <w:t>3</w:t>
-            </w:r>
-          </w:p>
-        </w:tc>
-        <w:tc>
-          <w:tcPr>
-            <w:tcW w:type="dxa" w:w="3288"/>
-          </w:tcPr>
-          <w:p>
-            <w:pPr>
-              <w:spacing w:before="0" w:after="0" w:line="276" w:lineRule="auto"/>
-              <w:jc w:val="left"/>
-            </w:pPr>
-            <w:r>
-              <w:rPr>
-                <w:rFonts w:ascii="Times New Roman" w:hAnsi="Times New Roman"/>
-                <w:color w:val="000000"/>
-                <w:sz w:val="21"/>
-              </w:rPr>
-              <w:t>Tali Lanyard &amp; ID Card Panitia Pelaksana</w:t>
-            </w:r>
-          </w:p>
-        </w:tc>
-        <w:tc>
-          <w:tcPr>
-            <w:tcW w:type="dxa" w:w="1247"/>
-          </w:tcPr>
-          <w:p>
-            <w:pPr>
-              <w:spacing w:before="0" w:after="0" w:line="276" w:lineRule="auto"/>
-              <w:jc w:val="center"/>
-            </w:pPr>
-            <w:r>
-              <w:rPr>
-                <w:rFonts w:ascii="Times New Roman" w:hAnsi="Times New Roman"/>
-                <w:color w:val="000000"/>
-                <w:sz w:val="21"/>
-              </w:rPr>
-              <w:t>20 pcs</w:t>
-            </w:r>
-          </w:p>
-        </w:tc>
-        <w:tc>
-          <w:tcPr>
-            <w:tcW w:type="dxa" w:w="1417"/>
-          </w:tcPr>
-          <w:p>
-            <w:pPr>
-              <w:spacing w:before="0" w:after="0" w:line="276" w:lineRule="auto"/>
-              <w:jc w:val="right"/>
-            </w:pPr>
-            <w:r>
-              <w:rPr>
-                <w:rFonts w:ascii="Times New Roman" w:hAnsi="Times New Roman"/>
-                <w:color w:val="000000"/>
-                <w:sz w:val="21"/>
-              </w:rPr>
-              <w:t>Rp. 2.500</w:t>
-            </w:r>
-          </w:p>
-        </w:tc>
-        <w:tc>
-          <w:tcPr>
-            <w:tcW w:type="dxa" w:w="1417"/>
-          </w:tcPr>
-          <w:p>
-            <w:pPr>
-              <w:spacing w:before="0" w:after="0" w:line="276" w:lineRule="auto"/>
-              <w:jc w:val="right"/>
-            </w:pPr>
-            <w:r>
-              <w:rPr>
-                <w:rFonts w:ascii="Times New Roman" w:hAnsi="Times New Roman"/>
-                <w:color w:val="000000"/>
-                <w:sz w:val="21"/>
-              </w:rPr>
-              <w:t>Rp. 50.000</w:t>
-            </w:r>
-          </w:p>
-        </w:tc>
-      </w:tr>
-      <w:tr>
-        <w:trPr>
-          <w:cantSplit/>
-        </w:trPr>
-        <w:tc>
-          <w:tcPr>
-            <w:tcW w:type="dxa" w:w="567"/>
-          </w:tcPr>
-          <w:p>
-            <w:pPr>
-              <w:spacing w:before="0" w:after="0" w:line="276" w:lineRule="auto"/>
-              <w:jc w:val="center"/>
-            </w:pPr>
-            <w:r>
-              <w:rPr>
-                <w:rFonts w:ascii="Times New Roman" w:hAnsi="Times New Roman"/>
-                <w:b/>
-                <w:color w:val="000000"/>
-                <w:sz w:val="21"/>
-              </w:rPr>
-            </w:r>
-          </w:p>
-        </w:tc>
-        <w:tc>
-          <w:tcPr>
-            <w:tcW w:type="dxa" w:w="3288"/>
-          </w:tcPr>
-          <w:p>
-            <w:pPr>
-              <w:spacing w:before="0" w:after="0" w:line="276" w:lineRule="auto"/>
-              <w:jc w:val="left"/>
-            </w:pPr>
-            <w:r>
-              <w:rPr>
-                <w:rFonts w:ascii="Times New Roman" w:hAnsi="Times New Roman"/>
-                <w:b/>
-                <w:color w:val="000000"/>
-                <w:sz w:val="21"/>
-              </w:rPr>
-              <w:t>TOTAL DIVISI PUBDOK</w:t>
-            </w:r>
-          </w:p>
-        </w:tc>
-        <w:tc>
-          <w:tcPr>
-            <w:tcW w:type="dxa" w:w="1247"/>
-          </w:tcPr>
-          <w:p>
-            <w:pPr>
-              <w:spacing w:before="0" w:after="0" w:line="276" w:lineRule="auto"/>
-              <w:jc w:val="center"/>
-            </w:pPr>
-            <w:r>
-              <w:rPr>
-                <w:rFonts w:ascii="Times New Roman" w:hAnsi="Times New Roman"/>
-                <w:b/>
-                <w:color w:val="000000"/>
-                <w:sz w:val="21"/>
-              </w:rPr>
-            </w:r>
-          </w:p>
-        </w:tc>
-        <w:tc>
-          <w:tcPr>
-            <w:tcW w:type="dxa" w:w="1417"/>
-          </w:tcPr>
-          <w:p>
-            <w:pPr>
-              <w:spacing w:before="0" w:after="0" w:line="276" w:lineRule="auto"/>
-              <w:jc w:val="right"/>
-            </w:pPr>
-            <w:r>
-              <w:rPr>
-                <w:rFonts w:ascii="Times New Roman" w:hAnsi="Times New Roman"/>
-                <w:b/>
-                <w:color w:val="000000"/>
-                <w:sz w:val="21"/>
-              </w:rPr>
-            </w:r>
-          </w:p>
-        </w:tc>
-        <w:tc>
-          <w:tcPr>
-            <w:tcW w:type="dxa" w:w="1417"/>
-          </w:tcPr>
-          <w:p>
-            <w:pPr>
-              <w:spacing w:before="0" w:after="0" w:line="276" w:lineRule="auto"/>
-              <w:jc w:val="right"/>
-            </w:pPr>
-            <w:r>
-              <w:rPr>
-                <w:rFonts w:ascii="Times New Roman" w:hAnsi="Times New Roman"/>
-                <w:b/>
-                <w:color w:val="000000"/>
-                <w:sz w:val="21"/>
-              </w:rPr>
-              <w:t>Rp. 500.000</w:t>
-            </w:r>
-          </w:p>
-        </w:tc>
-      </w:tr>
-    </w:tbl>
-    <w:p>
-      <w:pPr>
-        <w:spacing w:before="160" w:after="40"/>
-        <w:ind w:left="720"/>
-      </w:pPr>
-      <w:r>
-        <w:rPr>
-          <w:rFonts w:ascii="Times New Roman" w:hAnsi="Times New Roman"/>
-          <w:b/>
-          <w:sz w:val="23"/>
-        </w:rPr>
-        <w:t>4. Divisi Perlengkapan dan Logistik</w:t>
-      </w:r>
-    </w:p>
-    <w:tbl>
-      <w:tblPr>
-        <w:tblW w:type="auto" w:w="0"/>
-        <w:jc w:val="center"/>
-        <w:tblLayout w:type="fixed"/>
-        <w:tblLook w:firstColumn="1" w:firstRow="1" w:lastColumn="0" w:lastRow="0" w:noHBand="0" w:noVBand="1" w:val="04A0"/>
-        <w:tblBorders>
-          <w:top w:val="single" w:sz="6" w:space="0" w:color="000000"/>
-          <w:left w:val="single" w:sz="6" w:space="0" w:color="000000"/>
-          <w:bottom w:val="single" w:sz="6" w:space="0" w:color="000000"/>
-          <w:right w:val="single" w:sz="6" w:space="0" w:color="000000"/>
-          <w:insideH w:val="single" w:sz="6" w:space="0" w:color="000000"/>
-          <w:insideV w:val="single" w:sz="6" w:space="0" w:color="000000"/>
-        </w:tblBorders>
-        <w:tblCellMar>
-          <w:top w:w="100" w:type="dxa"/>
-          <w:bottom w:w="100" w:type="dxa"/>
-          <w:left w:w="140" w:type="dxa"/>
-          <w:right w:w="140" w:type="dxa"/>
-        </w:tblCellMar>
-      </w:tblPr>
-      <w:tblGrid>
-        <w:gridCol w:w="1587"/>
-        <w:gridCol w:w="1587"/>
-        <w:gridCol w:w="1587"/>
-        <w:gridCol w:w="1587"/>
-        <w:gridCol w:w="1587"/>
-      </w:tblGrid>
-      <w:tr>
-        <w:trPr>
-          <w:cantSplit/>
-          <w:tblHeader/>
-        </w:trPr>
-        <w:tc>
-          <w:tcPr>
-            <w:tcW w:type="dxa" w:w="567"/>
-            <w:shd w:fill="E0E0E0"/>
-          </w:tcPr>
-          <w:p>
-            <w:pPr>
-              <w:spacing w:before="0" w:after="0" w:line="240" w:lineRule="auto"/>
-              <w:jc w:val="center"/>
-            </w:pPr>
-            <w:r>
-              <w:rPr>
-                <w:rFonts w:ascii="Times New Roman" w:hAnsi="Times New Roman"/>
-                <w:b/>
-                <w:color w:val="000000"/>
-                <w:sz w:val="21"/>
-              </w:rPr>
-              <w:t>No</w:t>
-            </w:r>
-          </w:p>
-        </w:tc>
-        <w:tc>
-          <w:tcPr>
-            <w:tcW w:type="dxa" w:w="3288"/>
-            <w:shd w:fill="E0E0E0"/>
-          </w:tcPr>
-          <w:p>
-            <w:pPr>
-              <w:spacing w:before="0" w:after="0" w:line="240" w:lineRule="auto"/>
-              <w:jc w:val="center"/>
-            </w:pPr>
-            <w:r>
-              <w:rPr>
-                <w:rFonts w:ascii="Times New Roman" w:hAnsi="Times New Roman"/>
-                <w:b/>
-                <w:color w:val="000000"/>
-                <w:sz w:val="21"/>
-              </w:rPr>
-              <w:t>Uraian Kebutuhan</w:t>
-            </w:r>
-          </w:p>
-        </w:tc>
-        <w:tc>
-          <w:tcPr>
-            <w:tcW w:type="dxa" w:w="1247"/>
-            <w:shd w:fill="E0E0E0"/>
-          </w:tcPr>
-          <w:p>
-            <w:pPr>
-              <w:spacing w:before="0" w:after="0" w:line="240" w:lineRule="auto"/>
-              <w:jc w:val="center"/>
-            </w:pPr>
-            <w:r>
-              <w:rPr>
-                <w:rFonts w:ascii="Times New Roman" w:hAnsi="Times New Roman"/>
-                <w:b/>
-                <w:color w:val="000000"/>
-                <w:sz w:val="21"/>
-              </w:rPr>
-              <w:t>Qty</w:t>
-            </w:r>
-          </w:p>
-        </w:tc>
-        <w:tc>
-          <w:tcPr>
-            <w:tcW w:type="dxa" w:w="1417"/>
-            <w:shd w:fill="E0E0E0"/>
-          </w:tcPr>
-          <w:p>
-            <w:pPr>
-              <w:spacing w:before="0" w:after="0" w:line="240" w:lineRule="auto"/>
-              <w:jc w:val="center"/>
-            </w:pPr>
-            <w:r>
-              <w:rPr>
-                <w:rFonts w:ascii="Times New Roman" w:hAnsi="Times New Roman"/>
-                <w:b/>
-                <w:color w:val="000000"/>
-                <w:sz w:val="21"/>
-              </w:rPr>
-              <w:t>Harga Satuan</w:t>
-            </w:r>
-          </w:p>
-        </w:tc>
-        <w:tc>
-          <w:tcPr>
-            <w:tcW w:type="dxa" w:w="1417"/>
-            <w:shd w:fill="E0E0E0"/>
-          </w:tcPr>
-          <w:p>
-            <w:pPr>
-              <w:spacing w:before="0" w:after="0" w:line="240" w:lineRule="auto"/>
-              <w:jc w:val="center"/>
-            </w:pPr>
-            <w:r>
-              <w:rPr>
-                <w:rFonts w:ascii="Times New Roman" w:hAnsi="Times New Roman"/>
-                <w:b/>
-                <w:color w:val="000000"/>
-                <w:sz w:val="21"/>
-              </w:rPr>
-              <w:t>Subtotal</w:t>
-            </w:r>
-          </w:p>
-        </w:tc>
-      </w:tr>
-      <w:tr>
-        <w:trPr>
-          <w:cantSplit/>
-        </w:trPr>
-        <w:tc>
-          <w:tcPr>
-            <w:tcW w:type="dxa" w:w="567"/>
-          </w:tcPr>
-          <w:p>
-            <w:pPr>
-              <w:spacing w:before="0" w:after="0" w:line="276" w:lineRule="auto"/>
-              <w:jc w:val="center"/>
-            </w:pPr>
-            <w:r>
-              <w:rPr>
-                <w:rFonts w:ascii="Times New Roman" w:hAnsi="Times New Roman"/>
-                <w:color w:val="000000"/>
-                <w:sz w:val="21"/>
-              </w:rPr>
-              <w:t>1</w:t>
-            </w:r>
-          </w:p>
-        </w:tc>
-        <w:tc>
-          <w:tcPr>
-            <w:tcW w:type="dxa" w:w="3288"/>
-          </w:tcPr>
-          <w:p>
-            <w:pPr>
-              <w:spacing w:before="0" w:after="0" w:line="276" w:lineRule="auto"/>
-              <w:jc w:val="left"/>
-            </w:pPr>
-            <w:r>
-              <w:rPr>
-                <w:rFonts w:ascii="Times New Roman" w:hAnsi="Times New Roman"/>
-                <w:color w:val="000000"/>
-                <w:sz w:val="21"/>
-              </w:rPr>
-              <w:t>Sewa Kabel Roll Heavy Duty (Daya Tinggi)</w:t>
-            </w:r>
-          </w:p>
-        </w:tc>
-        <w:tc>
-          <w:tcPr>
-            <w:tcW w:type="dxa" w:w="1247"/>
-          </w:tcPr>
-          <w:p>
-            <w:pPr>
-              <w:spacing w:before="0" w:after="0" w:line="276" w:lineRule="auto"/>
-              <w:jc w:val="center"/>
-            </w:pPr>
-            <w:r>
-              <w:rPr>
-                <w:rFonts w:ascii="Times New Roman" w:hAnsi="Times New Roman"/>
-                <w:color w:val="000000"/>
-                <w:sz w:val="21"/>
-              </w:rPr>
-              <w:t>2 unit</w:t>
-            </w:r>
-          </w:p>
-        </w:tc>
-        <w:tc>
-          <w:tcPr>
-            <w:tcW w:type="dxa" w:w="1417"/>
-          </w:tcPr>
-          <w:p>
-            <w:pPr>
-              <w:spacing w:before="0" w:after="0" w:line="276" w:lineRule="auto"/>
-              <w:jc w:val="right"/>
-            </w:pPr>
-            <w:r>
-              <w:rPr>
-                <w:rFonts w:ascii="Times New Roman" w:hAnsi="Times New Roman"/>
-                <w:color w:val="000000"/>
-                <w:sz w:val="21"/>
-              </w:rPr>
-              <w:t>Rp. 100.000</w:t>
-            </w:r>
-          </w:p>
-        </w:tc>
-        <w:tc>
-          <w:tcPr>
-            <w:tcW w:type="dxa" w:w="1417"/>
-          </w:tcPr>
-          <w:p>
-            <w:pPr>
-              <w:spacing w:before="0" w:after="0" w:line="276" w:lineRule="auto"/>
-              <w:jc w:val="right"/>
-            </w:pPr>
-            <w:r>
-              <w:rPr>
-                <w:rFonts w:ascii="Times New Roman" w:hAnsi="Times New Roman"/>
-                <w:color w:val="000000"/>
-                <w:sz w:val="21"/>
-              </w:rPr>
-              <w:t>Rp. 200.000</w:t>
-            </w:r>
-          </w:p>
-        </w:tc>
-      </w:tr>
-      <w:tr>
-        <w:trPr>
-          <w:cantSplit/>
-        </w:trPr>
-        <w:tc>
-          <w:tcPr>
-            <w:tcW w:type="dxa" w:w="567"/>
-          </w:tcPr>
-          <w:p>
-            <w:pPr>
-              <w:spacing w:before="0" w:after="0" w:line="276" w:lineRule="auto"/>
-              <w:jc w:val="center"/>
-            </w:pPr>
-            <w:r>
-              <w:rPr>
-                <w:rFonts w:ascii="Times New Roman" w:hAnsi="Times New Roman"/>
-                <w:color w:val="000000"/>
-                <w:sz w:val="21"/>
-              </w:rPr>
-              <w:t>2</w:t>
-            </w:r>
-          </w:p>
-        </w:tc>
-        <w:tc>
-          <w:tcPr>
-            <w:tcW w:type="dxa" w:w="3288"/>
-          </w:tcPr>
-          <w:p>
-            <w:pPr>
-              <w:spacing w:before="0" w:after="0" w:line="276" w:lineRule="auto"/>
-              <w:jc w:val="left"/>
-            </w:pPr>
-            <w:r>
-              <w:rPr>
-                <w:rFonts w:ascii="Times New Roman" w:hAnsi="Times New Roman"/>
-                <w:color w:val="000000"/>
-                <w:sz w:val="21"/>
-              </w:rPr>
-              <w:t>Baterai Wireless Microphone (Alkaline AA/9V)</w:t>
-            </w:r>
-          </w:p>
-        </w:tc>
-        <w:tc>
-          <w:tcPr>
-            <w:tcW w:type="dxa" w:w="1247"/>
-          </w:tcPr>
-          <w:p>
-            <w:pPr>
-              <w:spacing w:before="0" w:after="0" w:line="276" w:lineRule="auto"/>
-              <w:jc w:val="center"/>
-            </w:pPr>
-            <w:r>
-              <w:rPr>
-                <w:rFonts w:ascii="Times New Roman" w:hAnsi="Times New Roman"/>
-                <w:color w:val="000000"/>
-                <w:sz w:val="21"/>
-              </w:rPr>
-              <w:t>4 set</w:t>
-            </w:r>
-          </w:p>
-        </w:tc>
-        <w:tc>
-          <w:tcPr>
-            <w:tcW w:type="dxa" w:w="1417"/>
-          </w:tcPr>
-          <w:p>
-            <w:pPr>
-              <w:spacing w:before="0" w:after="0" w:line="276" w:lineRule="auto"/>
-              <w:jc w:val="right"/>
-            </w:pPr>
-            <w:r>
-              <w:rPr>
-                <w:rFonts w:ascii="Times New Roman" w:hAnsi="Times New Roman"/>
-                <w:color w:val="000000"/>
-                <w:sz w:val="21"/>
-              </w:rPr>
-              <w:t>Rp. 25.000</w:t>
-            </w:r>
-          </w:p>
-        </w:tc>
-        <w:tc>
-          <w:tcPr>
-            <w:tcW w:type="dxa" w:w="1417"/>
-          </w:tcPr>
-          <w:p>
-            <w:pPr>
-              <w:spacing w:before="0" w:after="0" w:line="276" w:lineRule="auto"/>
-              <w:jc w:val="right"/>
-            </w:pPr>
-            <w:r>
-              <w:rPr>
-                <w:rFonts w:ascii="Times New Roman" w:hAnsi="Times New Roman"/>
-                <w:color w:val="000000"/>
-                <w:sz w:val="21"/>
-              </w:rPr>
-              <w:t>Rp. 100.000</w:t>
-            </w:r>
-          </w:p>
-        </w:tc>
-      </w:tr>
-      <w:tr>
-        <w:trPr>
-          <w:cantSplit/>
-        </w:trPr>
-        <w:tc>
-          <w:tcPr>
-            <w:tcW w:type="dxa" w:w="567"/>
-          </w:tcPr>
-          <w:p>
-            <w:pPr>
-              <w:spacing w:before="0" w:after="0" w:line="276" w:lineRule="auto"/>
-              <w:jc w:val="center"/>
-            </w:pPr>
-            <w:r>
-              <w:rPr>
-                <w:rFonts w:ascii="Times New Roman" w:hAnsi="Times New Roman"/>
-                <w:color w:val="000000"/>
-                <w:sz w:val="21"/>
-              </w:rPr>
-              <w:t>3</w:t>
-            </w:r>
-          </w:p>
-        </w:tc>
-        <w:tc>
-          <w:tcPr>
-            <w:tcW w:type="dxa" w:w="3288"/>
-          </w:tcPr>
-          <w:p>
-            <w:pPr>
-              <w:spacing w:before="0" w:after="0" w:line="276" w:lineRule="auto"/>
-              <w:jc w:val="left"/>
-            </w:pPr>
-            <w:r>
-              <w:rPr>
-                <w:rFonts w:ascii="Times New Roman" w:hAnsi="Times New Roman"/>
-                <w:color w:val="000000"/>
-                <w:sz w:val="21"/>
-              </w:rPr>
-              <w:t>Lakban Hitam Kabel &amp; Floor Marking Booth</w:t>
-            </w:r>
-          </w:p>
-        </w:tc>
-        <w:tc>
-          <w:tcPr>
-            <w:tcW w:type="dxa" w:w="1247"/>
-          </w:tcPr>
-          <w:p>
-            <w:pPr>
-              <w:spacing w:before="0" w:after="0" w:line="276" w:lineRule="auto"/>
-              <w:jc w:val="center"/>
-            </w:pPr>
-            <w:r>
-              <w:rPr>
-                <w:rFonts w:ascii="Times New Roman" w:hAnsi="Times New Roman"/>
-                <w:color w:val="000000"/>
-                <w:sz w:val="21"/>
-              </w:rPr>
-              <w:t>3 roll</w:t>
-            </w:r>
-          </w:p>
-        </w:tc>
-        <w:tc>
-          <w:tcPr>
-            <w:tcW w:type="dxa" w:w="1417"/>
-          </w:tcPr>
-          <w:p>
-            <w:pPr>
-              <w:spacing w:before="0" w:after="0" w:line="276" w:lineRule="auto"/>
-              <w:jc w:val="right"/>
-            </w:pPr>
-            <w:r>
-              <w:rPr>
-                <w:rFonts w:ascii="Times New Roman" w:hAnsi="Times New Roman"/>
-                <w:color w:val="000000"/>
-                <w:sz w:val="21"/>
-              </w:rPr>
-              <w:t>Rp. 25.000</w:t>
-            </w:r>
-          </w:p>
-        </w:tc>
-        <w:tc>
-          <w:tcPr>
-            <w:tcW w:type="dxa" w:w="1417"/>
-          </w:tcPr>
-          <w:p>
-            <w:pPr>
-              <w:spacing w:before="0" w:after="0" w:line="276" w:lineRule="auto"/>
-              <w:jc w:val="right"/>
-            </w:pPr>
-            <w:r>
-              <w:rPr>
-                <w:rFonts w:ascii="Times New Roman" w:hAnsi="Times New Roman"/>
-                <w:color w:val="000000"/>
-                <w:sz w:val="21"/>
-              </w:rPr>
-              <w:t>Rp. 75.000</w:t>
-            </w:r>
-          </w:p>
-        </w:tc>
-      </w:tr>
-      <w:tr>
-        <w:trPr>
-          <w:cantSplit/>
-        </w:trPr>
-        <w:tc>
-          <w:tcPr>
-            <w:tcW w:type="dxa" w:w="567"/>
-          </w:tcPr>
-          <w:p>
-            <w:pPr>
-              <w:spacing w:before="0" w:after="0" w:line="276" w:lineRule="auto"/>
-              <w:jc w:val="center"/>
-            </w:pPr>
-            <w:r>
-              <w:rPr>
-                <w:rFonts w:ascii="Times New Roman" w:hAnsi="Times New Roman"/>
-                <w:color w:val="000000"/>
-                <w:sz w:val="21"/>
-              </w:rPr>
-              <w:t>4</w:t>
-            </w:r>
-          </w:p>
-        </w:tc>
-        <w:tc>
-          <w:tcPr>
-            <w:tcW w:type="dxa" w:w="3288"/>
-          </w:tcPr>
-          <w:p>
-            <w:pPr>
-              <w:spacing w:before="0" w:after="0" w:line="276" w:lineRule="auto"/>
-              <w:jc w:val="left"/>
-            </w:pPr>
-            <w:r>
-              <w:rPr>
-                <w:rFonts w:ascii="Times New Roman" w:hAnsi="Times New Roman"/>
-                <w:color w:val="000000"/>
-                <w:sz w:val="21"/>
-              </w:rPr>
-              <w:t>Kantong Plastik Trash Bag &amp; Sarung Tangan</w:t>
-            </w:r>
-          </w:p>
-        </w:tc>
-        <w:tc>
-          <w:tcPr>
-            <w:tcW w:type="dxa" w:w="1247"/>
-          </w:tcPr>
-          <w:p>
-            <w:pPr>
-              <w:spacing w:before="0" w:after="0" w:line="276" w:lineRule="auto"/>
-              <w:jc w:val="center"/>
-            </w:pPr>
-            <w:r>
-              <w:rPr>
-                <w:rFonts w:ascii="Times New Roman" w:hAnsi="Times New Roman"/>
-                <w:color w:val="000000"/>
-                <w:sz w:val="21"/>
-              </w:rPr>
-              <w:t>3 pack</w:t>
-            </w:r>
-          </w:p>
-        </w:tc>
-        <w:tc>
-          <w:tcPr>
-            <w:tcW w:type="dxa" w:w="1417"/>
-          </w:tcPr>
-          <w:p>
-            <w:pPr>
-              <w:spacing w:before="0" w:after="0" w:line="276" w:lineRule="auto"/>
-              <w:jc w:val="right"/>
-            </w:pPr>
-            <w:r>
-              <w:rPr>
-                <w:rFonts w:ascii="Times New Roman" w:hAnsi="Times New Roman"/>
-                <w:color w:val="000000"/>
-                <w:sz w:val="21"/>
-              </w:rPr>
-              <w:t>Rp. 25.000</w:t>
-            </w:r>
-          </w:p>
-        </w:tc>
-        <w:tc>
-          <w:tcPr>
-            <w:tcW w:type="dxa" w:w="1417"/>
-          </w:tcPr>
-          <w:p>
-            <w:pPr>
-              <w:spacing w:before="0" w:after="0" w:line="276" w:lineRule="auto"/>
-              <w:jc w:val="right"/>
-            </w:pPr>
-            <w:r>
-              <w:rPr>
-                <w:rFonts w:ascii="Times New Roman" w:hAnsi="Times New Roman"/>
-                <w:color w:val="000000"/>
-                <w:sz w:val="21"/>
-              </w:rPr>
-              <w:t>Rp. 75.000</w:t>
-            </w:r>
-          </w:p>
-        </w:tc>
-      </w:tr>
-      <w:tr>
-        <w:trPr>
-          <w:cantSplit/>
-        </w:trPr>
-        <w:tc>
-          <w:tcPr>
-            <w:tcW w:type="dxa" w:w="567"/>
-          </w:tcPr>
-          <w:p>
-            <w:pPr>
-              <w:spacing w:before="0" w:after="0" w:line="276" w:lineRule="auto"/>
-              <w:jc w:val="center"/>
-            </w:pPr>
-            <w:r>
-              <w:rPr>
-                <w:rFonts w:ascii="Times New Roman" w:hAnsi="Times New Roman"/>
-                <w:b/>
-                <w:color w:val="000000"/>
-                <w:sz w:val="21"/>
-              </w:rPr>
-            </w:r>
-          </w:p>
-        </w:tc>
-        <w:tc>
-          <w:tcPr>
-            <w:tcW w:type="dxa" w:w="3288"/>
-          </w:tcPr>
-          <w:p>
-            <w:pPr>
-              <w:spacing w:before="0" w:after="0" w:line="276" w:lineRule="auto"/>
-              <w:jc w:val="left"/>
-            </w:pPr>
-            <w:r>
-              <w:rPr>
-                <w:rFonts w:ascii="Times New Roman" w:hAnsi="Times New Roman"/>
-                <w:b/>
-                <w:color w:val="000000"/>
-                <w:sz w:val="21"/>
-              </w:rPr>
-              <w:t>TOTAL DIVISI PERLENGKAPAN</w:t>
-            </w:r>
-          </w:p>
-        </w:tc>
-        <w:tc>
-          <w:tcPr>
-            <w:tcW w:type="dxa" w:w="1247"/>
-          </w:tcPr>
-          <w:p>
-            <w:pPr>
-              <w:spacing w:before="0" w:after="0" w:line="276" w:lineRule="auto"/>
-              <w:jc w:val="center"/>
-            </w:pPr>
-            <w:r>
-              <w:rPr>
-                <w:rFonts w:ascii="Times New Roman" w:hAnsi="Times New Roman"/>
-                <w:b/>
-                <w:color w:val="000000"/>
-                <w:sz w:val="21"/>
-              </w:rPr>
-            </w:r>
-          </w:p>
-        </w:tc>
-        <w:tc>
-          <w:tcPr>
-            <w:tcW w:type="dxa" w:w="1417"/>
-          </w:tcPr>
-          <w:p>
-            <w:pPr>
-              <w:spacing w:before="0" w:after="0" w:line="276" w:lineRule="auto"/>
-              <w:jc w:val="right"/>
-            </w:pPr>
-            <w:r>
-              <w:rPr>
-                <w:rFonts w:ascii="Times New Roman" w:hAnsi="Times New Roman"/>
-                <w:b/>
-                <w:color w:val="000000"/>
-                <w:sz w:val="21"/>
-              </w:rPr>
-            </w:r>
-          </w:p>
-        </w:tc>
-        <w:tc>
-          <w:tcPr>
-            <w:tcW w:type="dxa" w:w="1417"/>
-          </w:tcPr>
-          <w:p>
-            <w:pPr>
-              <w:spacing w:before="0" w:after="0" w:line="276" w:lineRule="auto"/>
-              <w:jc w:val="right"/>
-            </w:pPr>
-            <w:r>
-              <w:rPr>
-                <w:rFonts w:ascii="Times New Roman" w:hAnsi="Times New Roman"/>
-                <w:b/>
-                <w:color w:val="000000"/>
-                <w:sz w:val="21"/>
-              </w:rPr>
-              <w:t>Rp. 450.000</w:t>
-            </w:r>
-          </w:p>
-        </w:tc>
-      </w:tr>
-    </w:tbl>
-    <w:p>
-      <w:pPr>
-        <w:spacing w:before="160" w:after="40"/>
-        <w:ind w:left="720"/>
-      </w:pPr>
-      <w:r>
-        <w:rPr>
-          <w:rFonts w:ascii="Times New Roman" w:hAnsi="Times New Roman"/>
-          <w:b/>
-          <w:sz w:val="23"/>
-        </w:rPr>
-        <w:t>5. Divisi Humas dan P3K</w:t>
-      </w:r>
-    </w:p>
-    <w:tbl>
-      <w:tblPr>
-        <w:tblW w:type="auto" w:w="0"/>
-        <w:jc w:val="center"/>
-        <w:tblLayout w:type="fixed"/>
-        <w:tblLook w:firstColumn="1" w:firstRow="1" w:lastColumn="0" w:lastRow="0" w:noHBand="0" w:noVBand="1" w:val="04A0"/>
-        <w:tblBorders>
-          <w:top w:val="single" w:sz="6" w:space="0" w:color="000000"/>
-          <w:left w:val="single" w:sz="6" w:space="0" w:color="000000"/>
-          <w:bottom w:val="single" w:sz="6" w:space="0" w:color="000000"/>
-          <w:right w:val="single" w:sz="6" w:space="0" w:color="000000"/>
-          <w:insideH w:val="single" w:sz="6" w:space="0" w:color="000000"/>
-          <w:insideV w:val="single" w:sz="6" w:space="0" w:color="000000"/>
-        </w:tblBorders>
-        <w:tblCellMar>
-          <w:top w:w="100" w:type="dxa"/>
-          <w:bottom w:w="100" w:type="dxa"/>
-          <w:left w:w="140" w:type="dxa"/>
-          <w:right w:w="140" w:type="dxa"/>
-        </w:tblCellMar>
-      </w:tblPr>
-      <w:tblGrid>
-        <w:gridCol w:w="1587"/>
-        <w:gridCol w:w="1587"/>
-        <w:gridCol w:w="1587"/>
-        <w:gridCol w:w="1587"/>
-        <w:gridCol w:w="1587"/>
-      </w:tblGrid>
-      <w:tr>
-        <w:trPr>
-          <w:cantSplit/>
-          <w:tblHeader/>
-        </w:trPr>
-        <w:tc>
-          <w:tcPr>
-            <w:tcW w:type="dxa" w:w="567"/>
-            <w:shd w:fill="E0E0E0"/>
-          </w:tcPr>
-          <w:p>
-            <w:pPr>
-              <w:spacing w:before="0" w:after="0" w:line="240" w:lineRule="auto"/>
-              <w:jc w:val="center"/>
-            </w:pPr>
-            <w:r>
-              <w:rPr>
-                <w:rFonts w:ascii="Times New Roman" w:hAnsi="Times New Roman"/>
-                <w:b/>
-                <w:color w:val="000000"/>
-                <w:sz w:val="21"/>
-              </w:rPr>
-              <w:t>No</w:t>
-            </w:r>
-          </w:p>
-        </w:tc>
-        <w:tc>
-          <w:tcPr>
-            <w:tcW w:type="dxa" w:w="3288"/>
-            <w:shd w:fill="E0E0E0"/>
-          </w:tcPr>
-          <w:p>
-            <w:pPr>
-              <w:spacing w:before="0" w:after="0" w:line="240" w:lineRule="auto"/>
-              <w:jc w:val="center"/>
-            </w:pPr>
-            <w:r>
-              <w:rPr>
-                <w:rFonts w:ascii="Times New Roman" w:hAnsi="Times New Roman"/>
-                <w:b/>
-                <w:color w:val="000000"/>
-                <w:sz w:val="21"/>
-              </w:rPr>
-              <w:t>Uraian Kebutuhan</w:t>
-            </w:r>
-          </w:p>
-        </w:tc>
-        <w:tc>
-          <w:tcPr>
-            <w:tcW w:type="dxa" w:w="1247"/>
-            <w:shd w:fill="E0E0E0"/>
-          </w:tcPr>
-          <w:p>
-            <w:pPr>
-              <w:spacing w:before="0" w:after="0" w:line="240" w:lineRule="auto"/>
-              <w:jc w:val="center"/>
-            </w:pPr>
-            <w:r>
-              <w:rPr>
-                <w:rFonts w:ascii="Times New Roman" w:hAnsi="Times New Roman"/>
-                <w:b/>
-                <w:color w:val="000000"/>
-                <w:sz w:val="21"/>
-              </w:rPr>
-              <w:t>Qty</w:t>
-            </w:r>
-          </w:p>
-        </w:tc>
-        <w:tc>
-          <w:tcPr>
-            <w:tcW w:type="dxa" w:w="1417"/>
-            <w:shd w:fill="E0E0E0"/>
-          </w:tcPr>
-          <w:p>
-            <w:pPr>
-              <w:spacing w:before="0" w:after="0" w:line="240" w:lineRule="auto"/>
-              <w:jc w:val="center"/>
-            </w:pPr>
-            <w:r>
-              <w:rPr>
-                <w:rFonts w:ascii="Times New Roman" w:hAnsi="Times New Roman"/>
-                <w:b/>
-                <w:color w:val="000000"/>
-                <w:sz w:val="21"/>
-              </w:rPr>
-              <w:t>Harga Satuan</w:t>
-            </w:r>
-          </w:p>
-        </w:tc>
-        <w:tc>
-          <w:tcPr>
-            <w:tcW w:type="dxa" w:w="1417"/>
-            <w:shd w:fill="E0E0E0"/>
-          </w:tcPr>
-          <w:p>
-            <w:pPr>
-              <w:spacing w:before="0" w:after="0" w:line="240" w:lineRule="auto"/>
-              <w:jc w:val="center"/>
-            </w:pPr>
-            <w:r>
-              <w:rPr>
-                <w:rFonts w:ascii="Times New Roman" w:hAnsi="Times New Roman"/>
-                <w:b/>
-                <w:color w:val="000000"/>
-                <w:sz w:val="21"/>
-              </w:rPr>
-              <w:t>Subtotal</w:t>
-            </w:r>
-          </w:p>
-        </w:tc>
-      </w:tr>
-      <w:tr>
-        <w:trPr>
-          <w:cantSplit/>
-        </w:trPr>
-        <w:tc>
-          <w:tcPr>
-            <w:tcW w:type="dxa" w:w="567"/>
-          </w:tcPr>
-          <w:p>
-            <w:pPr>
-              <w:spacing w:before="0" w:after="0" w:line="276" w:lineRule="auto"/>
-              <w:jc w:val="center"/>
-            </w:pPr>
-            <w:r>
-              <w:rPr>
-                <w:rFonts w:ascii="Times New Roman" w:hAnsi="Times New Roman"/>
-                <w:color w:val="000000"/>
-                <w:sz w:val="21"/>
-              </w:rPr>
-              <w:t>1</w:t>
-            </w:r>
-          </w:p>
-        </w:tc>
-        <w:tc>
-          <w:tcPr>
-            <w:tcW w:type="dxa" w:w="3288"/>
-          </w:tcPr>
-          <w:p>
-            <w:pPr>
-              <w:spacing w:before="0" w:after="0" w:line="276" w:lineRule="auto"/>
-              <w:jc w:val="left"/>
-            </w:pPr>
-            <w:r>
-              <w:rPr>
-                <w:rFonts w:ascii="Times New Roman" w:hAnsi="Times New Roman"/>
-                <w:color w:val="000000"/>
-                <w:sz w:val="21"/>
-              </w:rPr>
-              <w:t>Air Mineral Botol &amp; Dus Meja Registrasi</w:t>
-            </w:r>
-          </w:p>
-        </w:tc>
-        <w:tc>
-          <w:tcPr>
-            <w:tcW w:type="dxa" w:w="1247"/>
-          </w:tcPr>
-          <w:p>
-            <w:pPr>
-              <w:spacing w:before="0" w:after="0" w:line="276" w:lineRule="auto"/>
-              <w:jc w:val="center"/>
-            </w:pPr>
-            <w:r>
-              <w:rPr>
-                <w:rFonts w:ascii="Times New Roman" w:hAnsi="Times New Roman"/>
-                <w:color w:val="000000"/>
-                <w:sz w:val="21"/>
-              </w:rPr>
-              <w:t>3 dus</w:t>
-            </w:r>
-          </w:p>
-        </w:tc>
-        <w:tc>
-          <w:tcPr>
-            <w:tcW w:type="dxa" w:w="1417"/>
-          </w:tcPr>
-          <w:p>
-            <w:pPr>
-              <w:spacing w:before="0" w:after="0" w:line="276" w:lineRule="auto"/>
-              <w:jc w:val="right"/>
-            </w:pPr>
-            <w:r>
-              <w:rPr>
-                <w:rFonts w:ascii="Times New Roman" w:hAnsi="Times New Roman"/>
-                <w:color w:val="000000"/>
-                <w:sz w:val="21"/>
-              </w:rPr>
-              <w:t>Rp. 50.000</w:t>
-            </w:r>
-          </w:p>
-        </w:tc>
-        <w:tc>
-          <w:tcPr>
-            <w:tcW w:type="dxa" w:w="1417"/>
-          </w:tcPr>
-          <w:p>
-            <w:pPr>
-              <w:spacing w:before="0" w:after="0" w:line="276" w:lineRule="auto"/>
-              <w:jc w:val="right"/>
-            </w:pPr>
-            <w:r>
-              <w:rPr>
-                <w:rFonts w:ascii="Times New Roman" w:hAnsi="Times New Roman"/>
-                <w:color w:val="000000"/>
-                <w:sz w:val="21"/>
-              </w:rPr>
-              <w:t>Rp. 150.000</w:t>
-            </w:r>
-          </w:p>
-        </w:tc>
-      </w:tr>
-      <w:tr>
-        <w:trPr>
-          <w:cantSplit/>
-        </w:trPr>
-        <w:tc>
-          <w:tcPr>
-            <w:tcW w:type="dxa" w:w="567"/>
-          </w:tcPr>
-          <w:p>
-            <w:pPr>
-              <w:spacing w:before="0" w:after="0" w:line="276" w:lineRule="auto"/>
-              <w:jc w:val="center"/>
-            </w:pPr>
-            <w:r>
-              <w:rPr>
-                <w:rFonts w:ascii="Times New Roman" w:hAnsi="Times New Roman"/>
-                <w:color w:val="000000"/>
-                <w:sz w:val="21"/>
-              </w:rPr>
-              <w:t>2</w:t>
-            </w:r>
-          </w:p>
-        </w:tc>
-        <w:tc>
-          <w:tcPr>
-            <w:tcW w:type="dxa" w:w="3288"/>
-          </w:tcPr>
-          <w:p>
-            <w:pPr>
-              <w:spacing w:before="0" w:after="0" w:line="276" w:lineRule="auto"/>
-              <w:jc w:val="left"/>
-            </w:pPr>
-            <w:r>
-              <w:rPr>
-                <w:rFonts w:ascii="Times New Roman" w:hAnsi="Times New Roman"/>
-                <w:color w:val="000000"/>
-                <w:sz w:val="21"/>
-              </w:rPr>
-              <w:t>Kotak Obat P3K &amp; Sanitizer Area Pemeriksaan</w:t>
-            </w:r>
-          </w:p>
-        </w:tc>
-        <w:tc>
-          <w:tcPr>
-            <w:tcW w:type="dxa" w:w="1247"/>
-          </w:tcPr>
-          <w:p>
-            <w:pPr>
-              <w:spacing w:before="0" w:after="0" w:line="276" w:lineRule="auto"/>
-              <w:jc w:val="center"/>
-            </w:pPr>
-            <w:r>
-              <w:rPr>
-                <w:rFonts w:ascii="Times New Roman" w:hAnsi="Times New Roman"/>
-                <w:color w:val="000000"/>
-                <w:sz w:val="21"/>
-              </w:rPr>
-              <w:t>1 paket</w:t>
-            </w:r>
-          </w:p>
-        </w:tc>
-        <w:tc>
-          <w:tcPr>
-            <w:tcW w:type="dxa" w:w="1417"/>
-          </w:tcPr>
-          <w:p>
-            <w:pPr>
-              <w:spacing w:before="0" w:after="0" w:line="276" w:lineRule="auto"/>
-              <w:jc w:val="right"/>
-            </w:pPr>
-            <w:r>
-              <w:rPr>
-                <w:rFonts w:ascii="Times New Roman" w:hAnsi="Times New Roman"/>
-                <w:color w:val="000000"/>
-                <w:sz w:val="21"/>
-              </w:rPr>
-              <w:t>Rp. 100.000</w:t>
-            </w:r>
-          </w:p>
-        </w:tc>
-        <w:tc>
-          <w:tcPr>
-            <w:tcW w:type="dxa" w:w="1417"/>
-          </w:tcPr>
-          <w:p>
-            <w:pPr>
-              <w:spacing w:before="0" w:after="0" w:line="276" w:lineRule="auto"/>
-              <w:jc w:val="right"/>
-            </w:pPr>
-            <w:r>
-              <w:rPr>
-                <w:rFonts w:ascii="Times New Roman" w:hAnsi="Times New Roman"/>
-                <w:color w:val="000000"/>
-                <w:sz w:val="21"/>
-              </w:rPr>
-              <w:t>Rp. 100.000</w:t>
-            </w:r>
-          </w:p>
-        </w:tc>
-      </w:tr>
-      <w:tr>
-        <w:trPr>
-          <w:cantSplit/>
-        </w:trPr>
-        <w:tc>
-          <w:tcPr>
-            <w:tcW w:type="dxa" w:w="567"/>
-          </w:tcPr>
-          <w:p>
-            <w:pPr>
-              <w:spacing w:before="0" w:after="0" w:line="276" w:lineRule="auto"/>
-              <w:jc w:val="center"/>
-            </w:pPr>
-            <w:r>
-              <w:rPr>
-                <w:rFonts w:ascii="Times New Roman" w:hAnsi="Times New Roman"/>
-                <w:b/>
-                <w:color w:val="000000"/>
-                <w:sz w:val="21"/>
-              </w:rPr>
-            </w:r>
-          </w:p>
-        </w:tc>
-        <w:tc>
-          <w:tcPr>
-            <w:tcW w:type="dxa" w:w="3288"/>
-          </w:tcPr>
-          <w:p>
-            <w:pPr>
-              <w:spacing w:before="0" w:after="0" w:line="276" w:lineRule="auto"/>
-              <w:jc w:val="left"/>
-            </w:pPr>
-            <w:r>
-              <w:rPr>
-                <w:rFonts w:ascii="Times New Roman" w:hAnsi="Times New Roman"/>
-                <w:b/>
-                <w:color w:val="000000"/>
-                <w:sz w:val="21"/>
-              </w:rPr>
-              <w:t>TOTAL DIVISI HUMAS &amp; P3K</w:t>
-            </w:r>
-          </w:p>
-        </w:tc>
-        <w:tc>
-          <w:tcPr>
-            <w:tcW w:type="dxa" w:w="1247"/>
-          </w:tcPr>
-          <w:p>
-            <w:pPr>
-              <w:spacing w:before="0" w:after="0" w:line="276" w:lineRule="auto"/>
-              <w:jc w:val="center"/>
-            </w:pPr>
-            <w:r>
-              <w:rPr>
-                <w:rFonts w:ascii="Times New Roman" w:hAnsi="Times New Roman"/>
-                <w:b/>
-                <w:color w:val="000000"/>
-                <w:sz w:val="21"/>
-              </w:rPr>
-            </w:r>
-          </w:p>
-        </w:tc>
-        <w:tc>
-          <w:tcPr>
-            <w:tcW w:type="dxa" w:w="1417"/>
-          </w:tcPr>
-          <w:p>
-            <w:pPr>
-              <w:spacing w:before="0" w:after="0" w:line="276" w:lineRule="auto"/>
-              <w:jc w:val="right"/>
-            </w:pPr>
-            <w:r>
-              <w:rPr>
-                <w:rFonts w:ascii="Times New Roman" w:hAnsi="Times New Roman"/>
-                <w:b/>
-                <w:color w:val="000000"/>
-                <w:sz w:val="21"/>
-              </w:rPr>
-            </w:r>
-          </w:p>
-        </w:tc>
-        <w:tc>
-          <w:tcPr>
-            <w:tcW w:type="dxa" w:w="1417"/>
-          </w:tcPr>
-          <w:p>
-            <w:pPr>
-              <w:spacing w:before="0" w:after="0" w:line="276" w:lineRule="auto"/>
-              <w:jc w:val="right"/>
-            </w:pPr>
-            <w:r>
-              <w:rPr>
-                <w:rFonts w:ascii="Times New Roman" w:hAnsi="Times New Roman"/>
-                <w:b/>
-                <w:color w:val="000000"/>
-                <w:sz w:val="21"/>
-              </w:rPr>
-              <w:t>Rp. 250.000</w:t>
-            </w:r>
-          </w:p>
-        </w:tc>
-      </w:tr>
-    </w:tbl>
     <w:p>
       <w:pPr>
         <w:keepNext/>
@@ -8500,482 +5835,12 @@
           <w:color w:val="000000"/>
           <w:sz w:val="24"/>
         </w:rPr>
-        <w:t>C. REKAPITULASI ANGGARAN BIAYA</w:t>
+        <w:t>C. RINGKASAN ANGGARAN KEGIATAN</w:t>
       </w:r>
     </w:p>
-    <w:tbl>
-      <w:tblPr>
-        <w:tblW w:type="auto" w:w="0"/>
-        <w:jc w:val="center"/>
-        <w:tblLayout w:type="fixed"/>
-        <w:tblLook w:firstColumn="1" w:firstRow="1" w:lastColumn="0" w:lastRow="0" w:noHBand="0" w:noVBand="1" w:val="04A0"/>
-        <w:tblBorders>
-          <w:top w:val="single" w:sz="6" w:space="0" w:color="000000"/>
-          <w:left w:val="single" w:sz="6" w:space="0" w:color="000000"/>
-          <w:bottom w:val="single" w:sz="6" w:space="0" w:color="000000"/>
-          <w:right w:val="single" w:sz="6" w:space="0" w:color="000000"/>
-          <w:insideH w:val="single" w:sz="6" w:space="0" w:color="000000"/>
-          <w:insideV w:val="single" w:sz="6" w:space="0" w:color="000000"/>
-        </w:tblBorders>
-        <w:tblCellMar>
-          <w:top w:w="100" w:type="dxa"/>
-          <w:bottom w:w="100" w:type="dxa"/>
-          <w:left w:w="140" w:type="dxa"/>
-          <w:right w:w="140" w:type="dxa"/>
-        </w:tblCellMar>
-      </w:tblPr>
-      <w:tblGrid>
-        <w:gridCol w:w="2646"/>
-        <w:gridCol w:w="2646"/>
-        <w:gridCol w:w="2646"/>
-      </w:tblGrid>
-      <w:tr>
-        <w:trPr>
-          <w:cantSplit/>
-          <w:tblHeader/>
-        </w:trPr>
-        <w:tc>
-          <w:tcPr>
-            <w:tcW w:type="dxa" w:w="680"/>
-            <w:shd w:fill="E0E0E0"/>
-          </w:tcPr>
-          <w:p>
-            <w:pPr>
-              <w:spacing w:before="0" w:after="0" w:line="240" w:lineRule="auto"/>
-              <w:jc w:val="center"/>
-            </w:pPr>
-            <w:r>
-              <w:rPr>
-                <w:rFonts w:ascii="Times New Roman" w:hAnsi="Times New Roman"/>
-                <w:b/>
-                <w:color w:val="000000"/>
-                <w:sz w:val="22"/>
-              </w:rPr>
-              <w:t>No</w:t>
-            </w:r>
-          </w:p>
-        </w:tc>
-        <w:tc>
-          <w:tcPr>
-            <w:tcW w:type="dxa" w:w="5272"/>
-            <w:shd w:fill="E0E0E0"/>
-          </w:tcPr>
-          <w:p>
-            <w:pPr>
-              <w:spacing w:before="0" w:after="0" w:line="240" w:lineRule="auto"/>
-              <w:jc w:val="center"/>
-            </w:pPr>
-            <w:r>
-              <w:rPr>
-                <w:rFonts w:ascii="Times New Roman" w:hAnsi="Times New Roman"/>
-                <w:b/>
-                <w:color w:val="000000"/>
-                <w:sz w:val="22"/>
-              </w:rPr>
-              <w:t>Divisi Operasional</w:t>
-            </w:r>
-          </w:p>
-        </w:tc>
-        <w:tc>
-          <w:tcPr>
-            <w:tcW w:type="dxa" w:w="1984"/>
-            <w:shd w:fill="E0E0E0"/>
-          </w:tcPr>
-          <w:p>
-            <w:pPr>
-              <w:spacing w:before="0" w:after="0" w:line="240" w:lineRule="auto"/>
-              <w:jc w:val="center"/>
-            </w:pPr>
-            <w:r>
-              <w:rPr>
-                <w:rFonts w:ascii="Times New Roman" w:hAnsi="Times New Roman"/>
-                <w:b/>
-                <w:color w:val="000000"/>
-                <w:sz w:val="22"/>
-              </w:rPr>
-              <w:t>Alokasi Dana</w:t>
-            </w:r>
-          </w:p>
-        </w:tc>
-      </w:tr>
-      <w:tr>
-        <w:trPr>
-          <w:cantSplit/>
-        </w:trPr>
-        <w:tc>
-          <w:tcPr>
-            <w:tcW w:type="dxa" w:w="680"/>
-          </w:tcPr>
-          <w:p>
-            <w:pPr>
-              <w:spacing w:before="0" w:after="0" w:line="276" w:lineRule="auto"/>
-              <w:jc w:val="center"/>
-            </w:pPr>
-            <w:r>
-              <w:rPr>
-                <w:rFonts w:ascii="Times New Roman" w:hAnsi="Times New Roman"/>
-                <w:color w:val="000000"/>
-                <w:sz w:val="22"/>
-              </w:rPr>
-              <w:t>1</w:t>
-            </w:r>
-          </w:p>
-        </w:tc>
-        <w:tc>
-          <w:tcPr>
-            <w:tcW w:type="dxa" w:w="5272"/>
-          </w:tcPr>
-          <w:p>
-            <w:pPr>
-              <w:spacing w:before="0" w:after="0" w:line="276" w:lineRule="auto"/>
-              <w:jc w:val="left"/>
-            </w:pPr>
-            <w:r>
-              <w:rPr>
-                <w:rFonts w:ascii="Times New Roman" w:hAnsi="Times New Roman"/>
-                <w:color w:val="000000"/>
-                <w:sz w:val="22"/>
-              </w:rPr>
-              <w:t>Divisi Acara</w:t>
-            </w:r>
-          </w:p>
-        </w:tc>
-        <w:tc>
-          <w:tcPr>
-            <w:tcW w:type="dxa" w:w="1984"/>
-          </w:tcPr>
-          <w:p>
-            <w:pPr>
-              <w:spacing w:before="0" w:after="0" w:line="276" w:lineRule="auto"/>
-              <w:jc w:val="right"/>
-            </w:pPr>
-            <w:r>
-              <w:rPr>
-                <w:rFonts w:ascii="Times New Roman" w:hAnsi="Times New Roman"/>
-                <w:color w:val="000000"/>
-                <w:sz w:val="22"/>
-              </w:rPr>
-              <w:t>Rp. 750.000</w:t>
-            </w:r>
-          </w:p>
-        </w:tc>
-      </w:tr>
-      <w:tr>
-        <w:trPr>
-          <w:cantSplit/>
-        </w:trPr>
-        <w:tc>
-          <w:tcPr>
-            <w:tcW w:type="dxa" w:w="680"/>
-          </w:tcPr>
-          <w:p>
-            <w:pPr>
-              <w:spacing w:before="0" w:after="0" w:line="276" w:lineRule="auto"/>
-              <w:jc w:val="center"/>
-            </w:pPr>
-            <w:r>
-              <w:rPr>
-                <w:rFonts w:ascii="Times New Roman" w:hAnsi="Times New Roman"/>
-                <w:color w:val="000000"/>
-                <w:sz w:val="22"/>
-              </w:rPr>
-              <w:t>2</w:t>
-            </w:r>
-          </w:p>
-        </w:tc>
-        <w:tc>
-          <w:tcPr>
-            <w:tcW w:type="dxa" w:w="5272"/>
-          </w:tcPr>
-          <w:p>
-            <w:pPr>
-              <w:spacing w:before="0" w:after="0" w:line="276" w:lineRule="auto"/>
-              <w:jc w:val="left"/>
-            </w:pPr>
-            <w:r>
-              <w:rPr>
-                <w:rFonts w:ascii="Times New Roman" w:hAnsi="Times New Roman"/>
-                <w:color w:val="000000"/>
-                <w:sz w:val="22"/>
-              </w:rPr>
-              <w:t>Divisi Konsumsi</w:t>
-            </w:r>
-          </w:p>
-        </w:tc>
-        <w:tc>
-          <w:tcPr>
-            <w:tcW w:type="dxa" w:w="1984"/>
-          </w:tcPr>
-          <w:p>
-            <w:pPr>
-              <w:spacing w:before="0" w:after="0" w:line="276" w:lineRule="auto"/>
-              <w:jc w:val="right"/>
-            </w:pPr>
-            <w:r>
-              <w:rPr>
-                <w:rFonts w:ascii="Times New Roman" w:hAnsi="Times New Roman"/>
-                <w:color w:val="000000"/>
-                <w:sz w:val="22"/>
-              </w:rPr>
-              <w:t>Rp. 1.050.000</w:t>
-            </w:r>
-          </w:p>
-        </w:tc>
-      </w:tr>
-      <w:tr>
-        <w:trPr>
-          <w:cantSplit/>
-        </w:trPr>
-        <w:tc>
-          <w:tcPr>
-            <w:tcW w:type="dxa" w:w="680"/>
-          </w:tcPr>
-          <w:p>
-            <w:pPr>
-              <w:spacing w:before="0" w:after="0" w:line="276" w:lineRule="auto"/>
-              <w:jc w:val="center"/>
-            </w:pPr>
-            <w:r>
-              <w:rPr>
-                <w:rFonts w:ascii="Times New Roman" w:hAnsi="Times New Roman"/>
-                <w:color w:val="000000"/>
-                <w:sz w:val="22"/>
-              </w:rPr>
-              <w:t>3</w:t>
-            </w:r>
-          </w:p>
-        </w:tc>
-        <w:tc>
-          <w:tcPr>
-            <w:tcW w:type="dxa" w:w="5272"/>
-          </w:tcPr>
-          <w:p>
-            <w:pPr>
-              <w:spacing w:before="0" w:after="0" w:line="276" w:lineRule="auto"/>
-              <w:jc w:val="left"/>
-            </w:pPr>
-            <w:r>
-              <w:rPr>
-                <w:rFonts w:ascii="Times New Roman" w:hAnsi="Times New Roman"/>
-                <w:color w:val="000000"/>
-                <w:sz w:val="22"/>
-              </w:rPr>
-              <w:t>Divisi Publikasi dan Dokumentasi (Pubdok)</w:t>
-            </w:r>
-          </w:p>
-        </w:tc>
-        <w:tc>
-          <w:tcPr>
-            <w:tcW w:type="dxa" w:w="1984"/>
-          </w:tcPr>
-          <w:p>
-            <w:pPr>
-              <w:spacing w:before="0" w:after="0" w:line="276" w:lineRule="auto"/>
-              <w:jc w:val="right"/>
-            </w:pPr>
-            <w:r>
-              <w:rPr>
-                <w:rFonts w:ascii="Times New Roman" w:hAnsi="Times New Roman"/>
-                <w:color w:val="000000"/>
-                <w:sz w:val="22"/>
-              </w:rPr>
-              <w:t>Rp. 500.000</w:t>
-            </w:r>
-          </w:p>
-        </w:tc>
-      </w:tr>
-      <w:tr>
-        <w:trPr>
-          <w:cantSplit/>
-        </w:trPr>
-        <w:tc>
-          <w:tcPr>
-            <w:tcW w:type="dxa" w:w="680"/>
-          </w:tcPr>
-          <w:p>
-            <w:pPr>
-              <w:spacing w:before="0" w:after="0" w:line="276" w:lineRule="auto"/>
-              <w:jc w:val="center"/>
-            </w:pPr>
-            <w:r>
-              <w:rPr>
-                <w:rFonts w:ascii="Times New Roman" w:hAnsi="Times New Roman"/>
-                <w:color w:val="000000"/>
-                <w:sz w:val="22"/>
-              </w:rPr>
-              <w:t>4</w:t>
-            </w:r>
-          </w:p>
-        </w:tc>
-        <w:tc>
-          <w:tcPr>
-            <w:tcW w:type="dxa" w:w="5272"/>
-          </w:tcPr>
-          <w:p>
-            <w:pPr>
-              <w:spacing w:before="0" w:after="0" w:line="276" w:lineRule="auto"/>
-              <w:jc w:val="left"/>
-            </w:pPr>
-            <w:r>
-              <w:rPr>
-                <w:rFonts w:ascii="Times New Roman" w:hAnsi="Times New Roman"/>
-                <w:color w:val="000000"/>
-                <w:sz w:val="22"/>
-              </w:rPr>
-              <w:t>Divisi Perlengkapan dan Logistik</w:t>
-            </w:r>
-          </w:p>
-        </w:tc>
-        <w:tc>
-          <w:tcPr>
-            <w:tcW w:type="dxa" w:w="1984"/>
-          </w:tcPr>
-          <w:p>
-            <w:pPr>
-              <w:spacing w:before="0" w:after="0" w:line="276" w:lineRule="auto"/>
-              <w:jc w:val="right"/>
-            </w:pPr>
-            <w:r>
-              <w:rPr>
-                <w:rFonts w:ascii="Times New Roman" w:hAnsi="Times New Roman"/>
-                <w:color w:val="000000"/>
-                <w:sz w:val="22"/>
-              </w:rPr>
-              <w:t>Rp. 450.000</w:t>
-            </w:r>
-          </w:p>
-        </w:tc>
-      </w:tr>
-      <w:tr>
-        <w:trPr>
-          <w:cantSplit/>
-        </w:trPr>
-        <w:tc>
-          <w:tcPr>
-            <w:tcW w:type="dxa" w:w="680"/>
-          </w:tcPr>
-          <w:p>
-            <w:pPr>
-              <w:spacing w:before="0" w:after="0" w:line="276" w:lineRule="auto"/>
-              <w:jc w:val="center"/>
-            </w:pPr>
-            <w:r>
-              <w:rPr>
-                <w:rFonts w:ascii="Times New Roman" w:hAnsi="Times New Roman"/>
-                <w:color w:val="000000"/>
-                <w:sz w:val="22"/>
-              </w:rPr>
-              <w:t>5</w:t>
-            </w:r>
-          </w:p>
-        </w:tc>
-        <w:tc>
-          <w:tcPr>
-            <w:tcW w:type="dxa" w:w="5272"/>
-          </w:tcPr>
-          <w:p>
-            <w:pPr>
-              <w:spacing w:before="0" w:after="0" w:line="276" w:lineRule="auto"/>
-              <w:jc w:val="left"/>
-            </w:pPr>
-            <w:r>
-              <w:rPr>
-                <w:rFonts w:ascii="Times New Roman" w:hAnsi="Times New Roman"/>
-                <w:color w:val="000000"/>
-                <w:sz w:val="22"/>
-              </w:rPr>
-              <w:t>Divisi Humas dan P3K</w:t>
-            </w:r>
-          </w:p>
-        </w:tc>
-        <w:tc>
-          <w:tcPr>
-            <w:tcW w:type="dxa" w:w="1984"/>
-          </w:tcPr>
-          <w:p>
-            <w:pPr>
-              <w:spacing w:before="0" w:after="0" w:line="276" w:lineRule="auto"/>
-              <w:jc w:val="right"/>
-            </w:pPr>
-            <w:r>
-              <w:rPr>
-                <w:rFonts w:ascii="Times New Roman" w:hAnsi="Times New Roman"/>
-                <w:color w:val="000000"/>
-                <w:sz w:val="22"/>
-              </w:rPr>
-              <w:t>Rp. 250.000</w:t>
-            </w:r>
-          </w:p>
-        </w:tc>
-      </w:tr>
-      <w:tr>
-        <w:trPr>
-          <w:cantSplit/>
-        </w:trPr>
-        <w:tc>
-          <w:tcPr>
-            <w:tcW w:type="dxa" w:w="680"/>
-          </w:tcPr>
-          <w:p>
-            <w:pPr>
-              <w:spacing w:before="0" w:after="0" w:line="276" w:lineRule="auto"/>
-              <w:jc w:val="center"/>
-            </w:pPr>
-            <w:r>
-              <w:rPr>
-                <w:rFonts w:ascii="Times New Roman" w:hAnsi="Times New Roman"/>
-                <w:b/>
-                <w:color w:val="000000"/>
-                <w:sz w:val="22"/>
-              </w:rPr>
-            </w:r>
-          </w:p>
-        </w:tc>
-        <w:tc>
-          <w:tcPr>
-            <w:tcW w:type="dxa" w:w="5272"/>
-          </w:tcPr>
-          <w:p>
-            <w:pPr>
-              <w:spacing w:before="0" w:after="0" w:line="276" w:lineRule="auto"/>
-              <w:jc w:val="left"/>
-            </w:pPr>
-            <w:r>
-              <w:rPr>
-                <w:rFonts w:ascii="Times New Roman" w:hAnsi="Times New Roman"/>
-                <w:b/>
-                <w:color w:val="000000"/>
-                <w:sz w:val="22"/>
-              </w:rPr>
-              <w:t>TOTAL PENGELUARAN</w:t>
-            </w:r>
-          </w:p>
-        </w:tc>
-        <w:tc>
-          <w:tcPr>
-            <w:tcW w:type="dxa" w:w="1984"/>
-          </w:tcPr>
-          <w:p>
-            <w:pPr>
-              <w:spacing w:before="0" w:after="0" w:line="276" w:lineRule="auto"/>
-              <w:jc w:val="right"/>
-            </w:pPr>
-            <w:r>
-              <w:rPr>
-                <w:rFonts w:ascii="Times New Roman" w:hAnsi="Times New Roman"/>
-                <w:b/>
-                <w:color w:val="000000"/>
-                <w:sz w:val="22"/>
-              </w:rPr>
-              <w:t>Rp. 3.000.000</w:t>
-            </w:r>
-          </w:p>
-        </w:tc>
-      </w:tr>
-    </w:tbl>
     <w:p>
       <w:pPr>
-        <w:spacing w:before="120" w:after="40"/>
+        <w:spacing w:before="80" w:after="40"/>
       </w:pPr>
     </w:p>
     <w:tbl>
@@ -9024,7 +5889,7 @@
                 <w:color w:val="000000"/>
                 <w:sz w:val="22"/>
               </w:rPr>
-              <w:t>Total Rencana Pemasukan</w:t>
+              <w:t>Total Penerimaan Sponsorship PT. Inti Citra Agung (Optik Melawai)</w:t>
             </w:r>
           </w:p>
         </w:tc>
@@ -9069,7 +5934,7 @@
                 <w:color w:val="000000"/>
                 <w:sz w:val="22"/>
               </w:rPr>
-              <w:t>Total Rencana Pengeluaran</w:t>
+              <w:t>Total Beban Pengeluaran BEM FEB UKRIDA</w:t>
             </w:r>
           </w:p>
         </w:tc>
@@ -9089,7 +5954,7 @@
                 <w:color w:val="000000"/>
                 <w:sz w:val="22"/>
               </w:rPr>
-              <w:t>Rp. 3.000.000</w:t>
+              <w:t>Rp. 0</w:t>
             </w:r>
           </w:p>
         </w:tc>
@@ -9115,7 +5980,7 @@
                 <w:color w:val="000000"/>
                 <w:sz w:val="22"/>
               </w:rPr>
-              <w:t>Sisa Saldo Anggaran (BALANCE)</w:t>
+              <w:t>Sisa Saldo Kas Masuk BEM FEB UKRIDA (Surplus)</w:t>
             </w:r>
           </w:p>
         </w:tc>
@@ -9136,7 +6001,7 @@
                 <w:color w:val="000000"/>
                 <w:sz w:val="22"/>
               </w:rPr>
-              <w:t>Rp. 0</w:t>
+              <w:t>Rp. 3.000.000</w:t>
             </w:r>
           </w:p>
         </w:tc>

</xml_diff>